<commit_message>
feat: complete week 1-2 notebooks with graded exercises
</commit_message>
<xml_diff>
--- a/week_1/week-01-José-Martínez.docx
+++ b/week_1/week-01-José-Martínez.docx
@@ -2,6 +2,348 @@
 <file path=word/document.xml><?xml version="1.0" encoding="utf-8"?>
 <w:document xmlns:wpc="http://schemas.microsoft.com/office/word/2010/wordprocessingCanvas" xmlns:cx="http://schemas.microsoft.com/office/drawing/2014/chartex" xmlns:cx1="http://schemas.microsoft.com/office/drawing/2015/9/8/chartex" xmlns:cx2="http://schemas.microsoft.com/office/drawing/2015/10/21/chartex" xmlns:cx3="http://schemas.microsoft.com/office/drawing/2016/5/9/chartex" xmlns:cx4="http://schemas.microsoft.com/office/drawing/2016/5/10/chartex" xmlns:cx5="http://schemas.microsoft.com/office/drawing/2016/5/11/chartex" xmlns:cx6="http://schemas.microsoft.com/office/drawing/2016/5/12/chartex" xmlns:cx7="http://schemas.microsoft.com/office/drawing/2016/5/13/chartex" xmlns:cx8="http://schemas.microsoft.com/office/drawing/2016/5/14/chartex" xmlns:mc="http://schemas.openxmlformats.org/markup-compatibility/2006" xmlns:aink="http://schemas.microsoft.com/office/drawing/2016/ink" xmlns:am3d="http://schemas.microsoft.com/office/drawing/2017/model3d" xmlns:o="urn:schemas-microsoft-com:office:office" xmlns:oel="http://schemas.microsoft.com/office/2019/extlst" xmlns:r="http://schemas.openxmlformats.org/officeDocument/2006/relationships" xmlns:m="http://schemas.openxmlformats.org/officeDocument/2006/math" xmlns:v="urn:schemas-microsoft-com:vml" xmlns:wp14="http://schemas.microsoft.com/office/word/2010/wordprocessingDrawing" xmlns:wp="http://schemas.openxmlformats.org/drawingml/2006/wordprocessingDrawing" xmlns:w10="urn:schemas-microsoft-com:office:word" xmlns:w="http://schemas.openxmlformats.org/wordprocessingml/2006/main" xmlns:w14="http://schemas.microsoft.com/office/word/2010/wordml" xmlns:w15="http://schemas.microsoft.com/office/word/2012/wordml" xmlns:w16cex="http://schemas.microsoft.com/office/word/2018/wordml/cex" xmlns:w16cid="http://schemas.microsoft.com/office/word/2016/wordml/cid" xmlns:w16="http://schemas.microsoft.com/office/word/2018/wordml" xmlns:w16du="http://schemas.microsoft.com/office/word/2023/wordml/word16du" xmlns:w16sdtdh="http://schemas.microsoft.com/office/word/2020/wordml/sdtdatahash" xmlns:w16sdtfl="http://schemas.microsoft.com/office/word/2024/wordml/sdtformatlock" xmlns:w16se="http://schemas.microsoft.com/office/word/2015/wordml/symex" xmlns:wpg="http://schemas.microsoft.com/office/word/2010/wordprocessingGroup" xmlns:wpi="http://schemas.microsoft.com/office/word/2010/wordprocessingInk" xmlns:wne="http://schemas.microsoft.com/office/word/2006/wordml" xmlns:wps="http://schemas.microsoft.com/office/word/2010/wordprocessingShape" mc:Ignorable="w14 w15 w16se w16cid w16 w16cex w16sdtdh w16sdtfl w16du wp14">
   <w:body>
+    <w:p>
+      <w:pPr>
+        <w:jc w:val="center"/>
+        <w:rPr>
+          <w:rFonts w:ascii="Arial" w:hAnsi="Arial" w:cs="Arial"/>
+          <w:b/>
+          <w:bCs/>
+          <w:lang w:val="en-US"/>
+        </w:rPr>
+      </w:pPr>
+      <w:r>
+        <w:rPr>
+          <w:rFonts w:ascii="Arial" w:hAnsi="Arial" w:cs="Arial"/>
+          <w:b/>
+          <w:bCs/>
+          <w:lang w:val="en-US"/>
+        </w:rPr>
+        <w:t>Lab &amp; Activities Week 01 LLM Fundamentals</w:t>
+      </w:r>
+    </w:p>
+    <w:p>
+      <w:pPr>
+        <w:spacing w:line="480" w:lineRule="auto"/>
+        <w:ind w:left="720" w:right="720"/>
+        <w:jc w:val="center"/>
+        <w:rPr>
+          <w:rFonts w:ascii="Arial" w:hAnsi="Arial" w:cs="Arial"/>
+          <w:b/>
+          <w:lang w:val="es-ES"/>
+        </w:rPr>
+      </w:pPr>
+    </w:p>
+    <w:p>
+      <w:pPr>
+        <w:spacing w:line="480" w:lineRule="auto"/>
+        <w:ind w:left="720" w:right="720"/>
+        <w:jc w:val="center"/>
+        <w:rPr>
+          <w:rFonts w:ascii="Arial" w:hAnsi="Arial" w:cs="Arial"/>
+          <w:b/>
+          <w:lang w:val="es-ES"/>
+        </w:rPr>
+      </w:pPr>
+    </w:p>
+    <w:p>
+      <w:pPr>
+        <w:spacing w:line="480" w:lineRule="auto"/>
+        <w:ind w:left="720" w:right="720"/>
+        <w:jc w:val="center"/>
+        <w:rPr>
+          <w:rFonts w:ascii="Arial" w:hAnsi="Arial" w:cs="Arial"/>
+          <w:b/>
+          <w:lang w:val="es-ES"/>
+        </w:rPr>
+      </w:pPr>
+    </w:p>
+    <w:p>
+      <w:pPr>
+        <w:spacing w:line="480" w:lineRule="auto"/>
+        <w:ind w:left="720" w:right="720"/>
+        <w:jc w:val="center"/>
+        <w:rPr>
+          <w:rFonts w:ascii="Arial" w:hAnsi="Arial" w:cs="Arial"/>
+          <w:b/>
+          <w:lang w:val="es-ES"/>
+        </w:rPr>
+      </w:pPr>
+    </w:p>
+    <w:p>
+      <w:pPr>
+        <w:spacing w:line="480" w:lineRule="auto"/>
+        <w:ind w:left="720" w:right="720"/>
+        <w:jc w:val="center"/>
+        <w:rPr>
+          <w:rFonts w:ascii="Arial" w:hAnsi="Arial" w:cs="Arial"/>
+          <w:b/>
+          <w:lang w:val="es-ES"/>
+        </w:rPr>
+      </w:pPr>
+    </w:p>
+    <w:p>
+      <w:pPr>
+        <w:pStyle w:val="Prrafodelista"/>
+        <w:spacing w:line="480" w:lineRule="auto"/>
+        <w:ind w:right="720"/>
+        <w:jc w:val="center"/>
+        <w:rPr>
+          <w:rFonts w:ascii="Arial" w:hAnsi="Arial" w:cs="Arial"/>
+          <w:b/>
+          <w:lang w:val="es-ES"/>
+        </w:rPr>
+      </w:pPr>
+      <w:r>
+        <w:rPr>
+          <w:rFonts w:ascii="Arial" w:hAnsi="Arial" w:cs="Arial"/>
+          <w:b/>
+          <w:lang w:val="es-ES"/>
+        </w:rPr>
+        <w:t>Integrantes:</w:t>
+      </w:r>
+    </w:p>
+    <w:p>
+      <w:pPr>
+        <w:pStyle w:val="Prrafodelista"/>
+        <w:spacing w:line="480" w:lineRule="auto"/>
+        <w:ind w:right="720"/>
+        <w:jc w:val="center"/>
+        <w:rPr>
+          <w:rFonts w:ascii="Arial" w:hAnsi="Arial" w:cs="Arial"/>
+          <w:lang w:val="es-ES"/>
+        </w:rPr>
+      </w:pPr>
+      <w:r>
+        <w:rPr>
+          <w:rFonts w:ascii="Arial" w:hAnsi="Arial" w:cs="Arial"/>
+          <w:lang w:val="es-ES"/>
+        </w:rPr>
+        <w:t>José Martínez-02220131016</w:t>
+      </w:r>
+    </w:p>
+    <w:p>
+      <w:pPr>
+        <w:pStyle w:val="Prrafodelista"/>
+        <w:spacing w:line="480" w:lineRule="auto"/>
+        <w:ind w:right="720"/>
+        <w:jc w:val="center"/>
+        <w:rPr>
+          <w:rFonts w:ascii="Arial" w:hAnsi="Arial" w:cs="Arial"/>
+          <w:bCs/>
+          <w:lang w:val="es-ES"/>
+        </w:rPr>
+      </w:pPr>
+    </w:p>
+    <w:p>
+      <w:pPr>
+        <w:pStyle w:val="Prrafodelista"/>
+        <w:spacing w:line="480" w:lineRule="auto"/>
+        <w:ind w:right="720"/>
+        <w:jc w:val="center"/>
+        <w:rPr>
+          <w:rFonts w:ascii="Arial" w:hAnsi="Arial" w:cs="Arial"/>
+          <w:bCs/>
+          <w:lang w:val="es-ES"/>
+        </w:rPr>
+      </w:pPr>
+    </w:p>
+    <w:p>
+      <w:pPr>
+        <w:pStyle w:val="Prrafodelista"/>
+        <w:spacing w:line="480" w:lineRule="auto"/>
+        <w:ind w:right="720"/>
+        <w:jc w:val="center"/>
+        <w:rPr>
+          <w:rFonts w:ascii="Arial" w:hAnsi="Arial" w:cs="Arial"/>
+          <w:bCs/>
+          <w:lang w:val="es-ES"/>
+        </w:rPr>
+      </w:pPr>
+    </w:p>
+    <w:p>
+      <w:pPr>
+        <w:pStyle w:val="Prrafodelista"/>
+        <w:spacing w:line="480" w:lineRule="auto"/>
+        <w:ind w:right="720"/>
+        <w:jc w:val="center"/>
+        <w:rPr>
+          <w:rFonts w:ascii="Arial" w:hAnsi="Arial" w:cs="Arial"/>
+          <w:bCs/>
+          <w:lang w:val="es-ES"/>
+        </w:rPr>
+      </w:pPr>
+    </w:p>
+    <w:p>
+      <w:pPr>
+        <w:spacing w:line="480" w:lineRule="auto"/>
+        <w:ind w:right="720"/>
+        <w:rPr>
+          <w:rFonts w:ascii="Arial" w:hAnsi="Arial" w:cs="Arial"/>
+          <w:bCs/>
+          <w:lang w:val="es-ES"/>
+        </w:rPr>
+      </w:pPr>
+    </w:p>
+    <w:p>
+      <w:pPr>
+        <w:pStyle w:val="Prrafodelista"/>
+        <w:spacing w:line="480" w:lineRule="auto"/>
+        <w:ind w:right="720"/>
+        <w:jc w:val="center"/>
+        <w:rPr>
+          <w:rFonts w:ascii="Arial" w:hAnsi="Arial" w:cs="Arial"/>
+          <w:bCs/>
+          <w:lang w:val="es-ES"/>
+        </w:rPr>
+      </w:pPr>
+    </w:p>
+    <w:p>
+      <w:pPr>
+        <w:pStyle w:val="Prrafodelista"/>
+        <w:spacing w:line="480" w:lineRule="auto"/>
+        <w:ind w:right="720"/>
+        <w:jc w:val="center"/>
+        <w:rPr>
+          <w:rFonts w:ascii="Arial" w:hAnsi="Arial" w:cs="Arial"/>
+          <w:bCs/>
+          <w:lang w:val="es-ES"/>
+        </w:rPr>
+      </w:pPr>
+    </w:p>
+    <w:p>
+      <w:pPr>
+        <w:spacing w:line="480" w:lineRule="auto"/>
+        <w:ind w:left="720" w:right="720"/>
+        <w:jc w:val="center"/>
+        <w:rPr>
+          <w:rFonts w:ascii="Arial" w:hAnsi="Arial" w:cs="Arial"/>
+          <w:bCs/>
+          <w:lang w:val="es-ES"/>
+        </w:rPr>
+      </w:pPr>
+    </w:p>
+    <w:p>
+      <w:pPr>
+        <w:pStyle w:val="Prrafodelista"/>
+        <w:spacing w:line="480" w:lineRule="auto"/>
+        <w:ind w:right="720"/>
+        <w:jc w:val="center"/>
+        <w:rPr>
+          <w:rFonts w:ascii="Arial" w:hAnsi="Arial" w:cs="Arial"/>
+          <w:lang w:val="es-ES"/>
+        </w:rPr>
+      </w:pPr>
+      <w:r>
+        <w:rPr>
+          <w:rFonts w:ascii="Arial" w:hAnsi="Arial" w:cs="Arial"/>
+          <w:b/>
+          <w:lang w:val="es-ES"/>
+        </w:rPr>
+        <w:t xml:space="preserve">Institución: </w:t>
+      </w:r>
+      <w:r>
+        <w:rPr>
+          <w:rFonts w:ascii="Arial" w:hAnsi="Arial" w:cs="Arial"/>
+          <w:lang w:val="es-ES"/>
+        </w:rPr>
+        <w:t>Universidad de Santander</w:t>
+      </w:r>
+    </w:p>
+    <w:p>
+      <w:pPr>
+        <w:pStyle w:val="Prrafodelista"/>
+        <w:spacing w:line="480" w:lineRule="auto"/>
+        <w:ind w:right="720"/>
+        <w:jc w:val="center"/>
+        <w:rPr>
+          <w:rFonts w:ascii="Arial" w:hAnsi="Arial" w:cs="Arial"/>
+          <w:lang w:val="es-ES"/>
+        </w:rPr>
+      </w:pPr>
+      <w:r>
+        <w:rPr>
+          <w:rFonts w:ascii="Arial" w:hAnsi="Arial" w:cs="Arial"/>
+          <w:b/>
+          <w:lang w:val="es-ES"/>
+        </w:rPr>
+        <w:t>Pregrado:</w:t>
+      </w:r>
+      <w:r>
+        <w:rPr>
+          <w:rFonts w:ascii="Arial" w:hAnsi="Arial" w:cs="Arial"/>
+          <w:lang w:val="es-ES"/>
+        </w:rPr>
+        <w:t xml:space="preserve"> Ingeniería Se Sistemas</w:t>
+      </w:r>
+    </w:p>
+    <w:p>
+      <w:pPr>
+        <w:pStyle w:val="Prrafodelista"/>
+        <w:spacing w:line="480" w:lineRule="auto"/>
+        <w:ind w:right="720"/>
+        <w:jc w:val="center"/>
+        <w:rPr>
+          <w:rFonts w:ascii="Arial" w:hAnsi="Arial" w:cs="Arial"/>
+        </w:rPr>
+      </w:pPr>
+      <w:r>
+        <w:rPr>
+          <w:rFonts w:ascii="Arial" w:hAnsi="Arial" w:cs="Arial"/>
+          <w:b/>
+        </w:rPr>
+        <w:t xml:space="preserve">Docente: </w:t>
+      </w:r>
+      <w:r>
+        <w:rPr>
+          <w:rFonts w:ascii="Arial" w:hAnsi="Arial" w:cs="Arial"/>
+        </w:rPr>
+        <w:t>Jorge Galvis</w:t>
+      </w:r>
+    </w:p>
+    <w:p>
+      <w:pPr>
+        <w:pStyle w:val="Prrafodelista"/>
+        <w:spacing w:line="480" w:lineRule="auto"/>
+        <w:ind w:right="720"/>
+        <w:jc w:val="center"/>
+        <w:rPr>
+          <w:rFonts w:ascii="Arial" w:hAnsi="Arial" w:cs="Arial"/>
+        </w:rPr>
+      </w:pPr>
+      <w:r>
+        <w:rPr>
+          <w:rFonts w:ascii="Arial" w:hAnsi="Arial" w:cs="Arial"/>
+        </w:rPr>
+        <w:t>25</w:t>
+      </w:r>
+      <w:r>
+        <w:rPr>
+          <w:rFonts w:ascii="Arial" w:hAnsi="Arial" w:cs="Arial"/>
+        </w:rPr>
+        <w:t xml:space="preserve"> de</w:t>
+      </w:r>
+      <w:r>
+        <w:rPr>
+          <w:rFonts w:ascii="Arial" w:hAnsi="Arial" w:cs="Arial"/>
+        </w:rPr>
+        <w:t xml:space="preserve"> </w:t>
+      </w:r>
+      <w:proofErr w:type="gramStart"/>
+      <w:r>
+        <w:rPr>
+          <w:rFonts w:ascii="Arial" w:hAnsi="Arial" w:cs="Arial"/>
+        </w:rPr>
+        <w:t>Agosto</w:t>
+      </w:r>
+      <w:proofErr w:type="gramEnd"/>
+      <w:r>
+        <w:rPr>
+          <w:rFonts w:ascii="Arial" w:hAnsi="Arial" w:cs="Arial"/>
+        </w:rPr>
+        <w:t xml:space="preserve"> 2026</w:t>
+      </w:r>
+    </w:p>
     <w:p>
       <w:pPr>
         <w:pStyle w:val="Ttulo1"/>
@@ -13,10 +355,12 @@
           <w:color w:val="auto"/>
           <w:sz w:val="24"/>
           <w:szCs w:val="24"/>
-          <w:lang w:val="es-419"/>
-        </w:rPr>
-      </w:pPr>
-      <w:r>
+        </w:rPr>
+      </w:pPr>
+    </w:p>
+    <w:p>
+      <w:pPr>
+        <w:pStyle w:val="Ttulo2"/>
         <w:rPr>
           <w:rFonts w:ascii="Arial" w:hAnsi="Arial" w:cs="Arial"/>
           <w:b/>
@@ -24,11 +368,9 @@
           <w:color w:val="auto"/>
           <w:sz w:val="24"/>
           <w:szCs w:val="24"/>
-          <w:lang w:val="es-419"/>
-        </w:rPr>
-        <w:t xml:space="preserve">Lab &amp; </w:t>
-      </w:r>
-      <w:proofErr w:type="spellStart"/>
+          <w:lang w:val="en-US"/>
+        </w:rPr>
+      </w:pPr>
       <w:r>
         <w:rPr>
           <w:rFonts w:ascii="Arial" w:hAnsi="Arial" w:cs="Arial"/>
@@ -37,76 +379,24 @@
           <w:color w:val="auto"/>
           <w:sz w:val="24"/>
           <w:szCs w:val="24"/>
+          <w:lang w:val="en-US"/>
+        </w:rPr>
+        <w:t>Activity 1</w:t>
+      </w:r>
+    </w:p>
+    <w:p>
+      <w:pPr>
+        <w:rPr>
+          <w:rFonts w:ascii="Arial" w:hAnsi="Arial" w:cs="Arial"/>
+          <w:sz w:val="22"/>
+          <w:szCs w:val="22"/>
           <w:lang w:val="es-419"/>
         </w:rPr>
-        <w:t>Activities</w:t>
-      </w:r>
-      <w:proofErr w:type="spellEnd"/>
-      <w:r>
-        <w:rPr>
-          <w:rFonts w:ascii="Arial" w:hAnsi="Arial" w:cs="Arial"/>
-          <w:b/>
-          <w:bCs/>
-          <w:color w:val="auto"/>
-          <w:sz w:val="24"/>
-          <w:szCs w:val="24"/>
-          <w:lang w:val="es-419"/>
-        </w:rPr>
-        <w:t xml:space="preserve"> Week 01 LLM Fundamentals</w:t>
-      </w:r>
-    </w:p>
-    <w:p>
-      <w:pPr>
-        <w:pStyle w:val="Ttulo2"/>
-        <w:rPr>
-          <w:rFonts w:ascii="Arial" w:hAnsi="Arial" w:cs="Arial"/>
-          <w:b/>
-          <w:bCs/>
-          <w:color w:val="auto"/>
-          <w:sz w:val="24"/>
-          <w:szCs w:val="24"/>
-          <w:lang w:val="es-419"/>
-        </w:rPr>
-      </w:pPr>
-      <w:proofErr w:type="spellStart"/>
-      <w:r>
-        <w:rPr>
-          <w:rFonts w:ascii="Arial" w:hAnsi="Arial" w:cs="Arial"/>
-          <w:b/>
-          <w:bCs/>
-          <w:color w:val="auto"/>
-          <w:sz w:val="24"/>
-          <w:szCs w:val="24"/>
-          <w:lang w:val="es-419"/>
-        </w:rPr>
-        <w:t>Activity</w:t>
-      </w:r>
-      <w:proofErr w:type="spellEnd"/>
-      <w:r>
-        <w:rPr>
-          <w:rFonts w:ascii="Arial" w:hAnsi="Arial" w:cs="Arial"/>
-          <w:b/>
-          <w:bCs/>
-          <w:color w:val="auto"/>
-          <w:sz w:val="24"/>
-          <w:szCs w:val="24"/>
-          <w:lang w:val="es-419"/>
-        </w:rPr>
-        <w:t xml:space="preserve"> 1</w:t>
-      </w:r>
-    </w:p>
-    <w:p>
-      <w:pPr>
-        <w:rPr>
-          <w:rFonts w:ascii="Arial" w:hAnsi="Arial" w:cs="Arial"/>
-          <w:sz w:val="22"/>
-          <w:szCs w:val="22"/>
-          <w:lang w:val="es-419"/>
-        </w:rPr>
-      </w:pPr>
-      <w:r>
-        <w:rPr>
-          <w:rFonts w:ascii="Arial" w:hAnsi="Arial" w:cs="Arial"/>
+      </w:pPr>
+      <w:r>
+        <w:rPr>
+          <w:rFonts w:ascii="Arial" w:hAnsi="Arial" w:cs="Arial"/>
+          <w:noProof/>
           <w:sz w:val="22"/>
           <w:szCs w:val="22"/>
           <w:lang w:val="es-419"/>
@@ -127,7 +417,7 @@
                     <pic:cNvPicPr/>
                   </pic:nvPicPr>
                   <pic:blipFill>
-                    <a:blip r:embed="rId5"/>
+                    <a:blip r:embed="rId7"/>
                     <a:stretch>
                       <a:fillRect/>
                     </a:stretch>
@@ -160,6 +450,7 @@
       <w:r>
         <w:rPr>
           <w:rFonts w:ascii="Arial" w:hAnsi="Arial" w:cs="Arial"/>
+          <w:noProof/>
           <w:sz w:val="22"/>
           <w:szCs w:val="22"/>
           <w:lang w:val="es-419"/>
@@ -180,7 +471,7 @@
                     <pic:cNvPicPr/>
                   </pic:nvPicPr>
                   <pic:blipFill>
-                    <a:blip r:embed="rId6"/>
+                    <a:blip r:embed="rId8"/>
                     <a:stretch>
                       <a:fillRect/>
                     </a:stretch>
@@ -213,6 +504,7 @@
       <w:r>
         <w:rPr>
           <w:rFonts w:ascii="Arial" w:hAnsi="Arial" w:cs="Arial"/>
+          <w:noProof/>
           <w:sz w:val="22"/>
           <w:szCs w:val="22"/>
           <w:lang w:val="es-419"/>
@@ -234,7 +526,7 @@
                     <pic:cNvPicPr/>
                   </pic:nvPicPr>
                   <pic:blipFill>
-                    <a:blip r:embed="rId7"/>
+                    <a:blip r:embed="rId9"/>
                     <a:stretch>
                       <a:fillRect/>
                     </a:stretch>
@@ -278,19 +570,7 @@
           <w:szCs w:val="24"/>
           <w:lang w:val="en-US"/>
         </w:rPr>
-        <w:t xml:space="preserve">Activity </w:t>
-      </w:r>
-      <w:r>
-        <w:rPr>
-          <w:rFonts w:ascii="Arial" w:hAnsi="Arial" w:cs="Arial"/>
-          <w:b/>
-          <w:bCs/>
-          <w:color w:val="auto"/>
-          <w:sz w:val="24"/>
-          <w:szCs w:val="24"/>
-          <w:lang w:val="en-US"/>
-        </w:rPr>
-        <w:t>2</w:t>
+        <w:t>Activity 2</w:t>
       </w:r>
     </w:p>
     <w:p>
@@ -388,6 +668,7 @@
       <w:r>
         <w:rPr>
           <w:rFonts w:ascii="Arial" w:hAnsi="Arial" w:cs="Arial"/>
+          <w:noProof/>
           <w:sz w:val="22"/>
           <w:szCs w:val="22"/>
           <w:lang w:val="en-US"/>
@@ -408,7 +689,7 @@
                     <pic:cNvPicPr/>
                   </pic:nvPicPr>
                   <pic:blipFill>
-                    <a:blip r:embed="rId8"/>
+                    <a:blip r:embed="rId10"/>
                     <a:stretch>
                       <a:fillRect/>
                     </a:stretch>
@@ -461,29 +742,7 @@
           <w:szCs w:val="22"/>
           <w:lang w:val="en-US"/>
         </w:rPr>
-        <w:t>“</w:t>
-      </w:r>
-      <w:r>
-        <w:rPr>
-          <w:rFonts w:ascii="Arial" w:hAnsi="Arial" w:cs="Arial"/>
-          <w:i/>
-          <w:iCs/>
-          <w:sz w:val="22"/>
-          <w:szCs w:val="22"/>
-          <w:lang w:val="en-US"/>
-        </w:rPr>
-        <w:t>A large language model is an artificial intelligence system trained on vast amounts of text data to understand, process, and generate human-like language.</w:t>
-      </w:r>
-      <w:r>
-        <w:rPr>
-          <w:rFonts w:ascii="Arial" w:hAnsi="Arial" w:cs="Arial"/>
-          <w:i/>
-          <w:iCs/>
-          <w:sz w:val="22"/>
-          <w:szCs w:val="22"/>
-          <w:lang w:val="en-US"/>
-        </w:rPr>
-        <w:t>”</w:t>
+        <w:t>“A large language model is an artificial intelligence system trained on vast amounts of text data to understand, process, and generate human-like language.”</w:t>
       </w:r>
     </w:p>
     <w:p>
@@ -522,6 +781,7 @@
       <w:r>
         <w:rPr>
           <w:rFonts w:ascii="Arial" w:hAnsi="Arial" w:cs="Arial"/>
+          <w:noProof/>
           <w:sz w:val="22"/>
           <w:szCs w:val="22"/>
           <w:lang w:val="en-US"/>
@@ -543,7 +803,7 @@
                     <pic:cNvPicPr/>
                   </pic:nvPicPr>
                   <pic:blipFill>
-                    <a:blip r:embed="rId9"/>
+                    <a:blip r:embed="rId11"/>
                     <a:stretch>
                       <a:fillRect/>
                     </a:stretch>
@@ -657,6 +917,7 @@
       <w:r>
         <w:rPr>
           <w:rFonts w:ascii="Arial" w:hAnsi="Arial" w:cs="Arial"/>
+          <w:noProof/>
           <w:sz w:val="22"/>
           <w:szCs w:val="22"/>
           <w:lang w:val="en-US"/>
@@ -677,7 +938,7 @@
                     <pic:cNvPicPr/>
                   </pic:nvPicPr>
                   <pic:blipFill>
-                    <a:blip r:embed="rId10"/>
+                    <a:blip r:embed="rId12"/>
                     <a:stretch>
                       <a:fillRect/>
                     </a:stretch>
@@ -803,6 +1064,17 @@
     </w:p>
     <w:p>
       <w:pPr>
+        <w:ind w:left="720"/>
+        <w:rPr>
+          <w:rFonts w:ascii="Arial" w:hAnsi="Arial" w:cs="Arial"/>
+          <w:sz w:val="22"/>
+          <w:szCs w:val="22"/>
+          <w:lang w:val="en-US"/>
+        </w:rPr>
+      </w:pPr>
+    </w:p>
+    <w:p>
+      <w:pPr>
         <w:numPr>
           <w:ilvl w:val="0"/>
           <w:numId w:val="2"/>
@@ -851,27 +1123,17 @@
           <w:rFonts w:ascii="Arial" w:hAnsi="Arial" w:cs="Arial"/>
           <w:sz w:val="22"/>
           <w:szCs w:val="22"/>
-          <w:lang w:val="es-419"/>
-        </w:rPr>
-      </w:pPr>
-    </w:p>
-    <w:p>
-      <w:pPr>
-        <w:rPr>
-          <w:rFonts w:ascii="Arial" w:hAnsi="Arial" w:cs="Arial"/>
-          <w:sz w:val="22"/>
-          <w:szCs w:val="22"/>
-          <w:lang w:val="en-US"/>
-        </w:rPr>
-      </w:pPr>
-      <w:r>
-        <w:rPr>
-          <w:rFonts w:ascii="Arial" w:hAnsi="Arial" w:cs="Arial"/>
-          <w:sz w:val="22"/>
-          <w:szCs w:val="22"/>
-          <w:lang w:val="en-US"/>
-        </w:rPr>
-        <w:t xml:space="preserve">Case-in-point discussion: the instructor will show a real production incident caused by an unexpectedly high temperature default in a data-extraction pipeline — a preview of why these knobs </w:t>
+          <w:lang w:val="en-US"/>
+        </w:rPr>
+      </w:pPr>
+      <w:r>
+        <w:rPr>
+          <w:rFonts w:ascii="Arial" w:hAnsi="Arial" w:cs="Arial"/>
+          <w:sz w:val="22"/>
+          <w:szCs w:val="22"/>
+          <w:lang w:val="en-US"/>
+        </w:rPr>
+        <w:t xml:space="preserve">For this part of the </w:t>
       </w:r>
       <w:proofErr w:type="gramStart"/>
       <w:r>
@@ -881,7 +1143,7 @@
           <w:szCs w:val="22"/>
           <w:lang w:val="en-US"/>
         </w:rPr>
-        <w:t>are</w:t>
+        <w:t>activity</w:t>
       </w:r>
       <w:proofErr w:type="gramEnd"/>
       <w:r>
@@ -891,7 +1153,456 @@
           <w:szCs w:val="22"/>
           <w:lang w:val="en-US"/>
         </w:rPr>
-        <w:t xml:space="preserve"> an engineering decision, not just a creativity dial.</w:t>
+        <w:t xml:space="preserve"> I add another phrase but in Spanish to see de difference between the tokenization in different languages, because the Spanish words have different tokenization heigh than the English words </w:t>
+      </w:r>
+    </w:p>
+    <w:p>
+      <w:pPr>
+        <w:ind w:left="720"/>
+        <w:rPr>
+          <w:rFonts w:ascii="Arial" w:hAnsi="Arial" w:cs="Arial"/>
+          <w:sz w:val="22"/>
+          <w:szCs w:val="22"/>
+          <w:lang w:val="en-US"/>
+        </w:rPr>
+      </w:pPr>
+      <w:r>
+        <w:rPr>
+          <w:rFonts w:ascii="Arial" w:hAnsi="Arial" w:cs="Arial"/>
+          <w:sz w:val="22"/>
+          <w:szCs w:val="22"/>
+          <w:lang w:val="en-US"/>
+        </w:rPr>
+        <w:t xml:space="preserve">The phrases </w:t>
+      </w:r>
+      <w:proofErr w:type="gramStart"/>
+      <w:r>
+        <w:rPr>
+          <w:rFonts w:ascii="Arial" w:hAnsi="Arial" w:cs="Arial"/>
+          <w:sz w:val="22"/>
+          <w:szCs w:val="22"/>
+          <w:lang w:val="en-US"/>
+        </w:rPr>
+        <w:t>was</w:t>
+      </w:r>
+      <w:proofErr w:type="gramEnd"/>
+      <w:r>
+        <w:rPr>
+          <w:rFonts w:ascii="Arial" w:hAnsi="Arial" w:cs="Arial"/>
+          <w:sz w:val="22"/>
+          <w:szCs w:val="22"/>
+          <w:lang w:val="en-US"/>
+        </w:rPr>
+        <w:t>:</w:t>
+      </w:r>
+      <w:r>
+        <w:rPr>
+          <w:rFonts w:ascii="Arial" w:hAnsi="Arial" w:cs="Arial"/>
+          <w:sz w:val="22"/>
+          <w:szCs w:val="22"/>
+          <w:lang w:val="en-US"/>
+        </w:rPr>
+        <w:br/>
+      </w:r>
+      <w:r>
+        <w:rPr>
+          <w:rFonts w:ascii="Arial" w:hAnsi="Arial" w:cs="Arial"/>
+          <w:sz w:val="22"/>
+          <w:szCs w:val="22"/>
+          <w:lang w:val="en-US"/>
+        </w:rPr>
+        <w:t> </w:t>
+      </w:r>
+      <w:r>
+        <w:rPr>
+          <w:rFonts w:ascii="Arial" w:hAnsi="Arial" w:cs="Arial"/>
+          <w:sz w:val="22"/>
+          <w:szCs w:val="22"/>
+          <w:lang w:val="en-US"/>
+        </w:rPr>
+        <w:t xml:space="preserve">- </w:t>
+      </w:r>
+      <w:r>
+        <w:rPr>
+          <w:rFonts w:ascii="Arial" w:hAnsi="Arial" w:cs="Arial"/>
+          <w:sz w:val="22"/>
+          <w:szCs w:val="22"/>
+          <w:lang w:val="en-US"/>
+        </w:rPr>
+        <w:t>"Hi!",</w:t>
+      </w:r>
+    </w:p>
+    <w:p>
+      <w:pPr>
+        <w:ind w:left="720"/>
+        <w:rPr>
+          <w:rFonts w:ascii="Arial" w:hAnsi="Arial" w:cs="Arial"/>
+          <w:sz w:val="22"/>
+          <w:szCs w:val="22"/>
+          <w:lang w:val="en-US"/>
+        </w:rPr>
+      </w:pPr>
+      <w:r>
+        <w:rPr>
+          <w:rFonts w:ascii="Arial" w:hAnsi="Arial" w:cs="Arial"/>
+          <w:sz w:val="22"/>
+          <w:szCs w:val="22"/>
+          <w:lang w:val="en-US"/>
+        </w:rPr>
+        <w:t> </w:t>
+      </w:r>
+      <w:r>
+        <w:rPr>
+          <w:rFonts w:ascii="Arial" w:hAnsi="Arial" w:cs="Arial"/>
+          <w:sz w:val="22"/>
+          <w:szCs w:val="22"/>
+          <w:lang w:val="en-US"/>
+        </w:rPr>
+        <w:t xml:space="preserve">- </w:t>
+      </w:r>
+      <w:r>
+        <w:rPr>
+          <w:rFonts w:ascii="Arial" w:hAnsi="Arial" w:cs="Arial"/>
+          <w:sz w:val="22"/>
+          <w:szCs w:val="22"/>
+          <w:lang w:val="en-US"/>
+        </w:rPr>
+        <w:t>"The capital of France is Paris.",</w:t>
+      </w:r>
+    </w:p>
+    <w:p>
+      <w:pPr>
+        <w:ind w:left="720"/>
+        <w:rPr>
+          <w:rFonts w:ascii="Arial" w:hAnsi="Arial" w:cs="Arial"/>
+          <w:sz w:val="22"/>
+          <w:szCs w:val="22"/>
+          <w:lang w:val="en-US"/>
+        </w:rPr>
+      </w:pPr>
+      <w:r>
+        <w:rPr>
+          <w:rFonts w:ascii="Arial" w:hAnsi="Arial" w:cs="Arial"/>
+          <w:sz w:val="22"/>
+          <w:szCs w:val="22"/>
+          <w:lang w:val="en-US"/>
+        </w:rPr>
+        <w:t> </w:t>
+      </w:r>
+      <w:r>
+        <w:rPr>
+          <w:rFonts w:ascii="Arial" w:hAnsi="Arial" w:cs="Arial"/>
+          <w:sz w:val="22"/>
+          <w:szCs w:val="22"/>
+          <w:lang w:val="en-US"/>
+        </w:rPr>
+        <w:t xml:space="preserve">- </w:t>
+      </w:r>
+      <w:r>
+        <w:rPr>
+          <w:rFonts w:ascii="Arial" w:hAnsi="Arial" w:cs="Arial"/>
+          <w:sz w:val="22"/>
+          <w:szCs w:val="22"/>
+          <w:lang w:val="en-US"/>
+        </w:rPr>
+        <w:t>"AI Agentic Engineering is a course about building autonomous systems with</w:t>
+      </w:r>
+      <w:r>
+        <w:rPr>
+          <w:rFonts w:ascii="Arial" w:hAnsi="Arial" w:cs="Arial"/>
+          <w:sz w:val="22"/>
+          <w:szCs w:val="22"/>
+          <w:lang w:val="en-US"/>
+        </w:rPr>
+        <w:t xml:space="preserve"> </w:t>
+      </w:r>
+      <w:r>
+        <w:rPr>
+          <w:rFonts w:ascii="Arial" w:hAnsi="Arial" w:cs="Arial"/>
+          <w:sz w:val="22"/>
+          <w:szCs w:val="22"/>
+          <w:lang w:val="en-US"/>
+        </w:rPr>
+        <w:t>large language models, "</w:t>
+      </w:r>
+    </w:p>
+    <w:p>
+      <w:pPr>
+        <w:ind w:left="720"/>
+        <w:rPr>
+          <w:rFonts w:ascii="Arial" w:hAnsi="Arial" w:cs="Arial"/>
+          <w:sz w:val="22"/>
+          <w:szCs w:val="22"/>
+          <w:lang w:val="en-US"/>
+        </w:rPr>
+      </w:pPr>
+      <w:r>
+        <w:rPr>
+          <w:rFonts w:ascii="Arial" w:hAnsi="Arial" w:cs="Arial"/>
+          <w:sz w:val="22"/>
+          <w:szCs w:val="22"/>
+          <w:lang w:val="en-US"/>
+        </w:rPr>
+        <w:t xml:space="preserve"> - </w:t>
+      </w:r>
+      <w:r>
+        <w:rPr>
+          <w:rFonts w:ascii="Arial" w:hAnsi="Arial" w:cs="Arial"/>
+          <w:sz w:val="22"/>
+          <w:szCs w:val="22"/>
+          <w:lang w:val="en-US"/>
+        </w:rPr>
+        <w:t xml:space="preserve">"retrieval-augmented generation, and multi-agent orchestration frameworks like Google ADK and </w:t>
+      </w:r>
+      <w:proofErr w:type="spellStart"/>
+      <w:r>
+        <w:rPr>
+          <w:rFonts w:ascii="Arial" w:hAnsi="Arial" w:cs="Arial"/>
+          <w:sz w:val="22"/>
+          <w:szCs w:val="22"/>
+          <w:lang w:val="en-US"/>
+        </w:rPr>
+        <w:t>LangGraph</w:t>
+      </w:r>
+      <w:proofErr w:type="spellEnd"/>
+      <w:r>
+        <w:rPr>
+          <w:rFonts w:ascii="Arial" w:hAnsi="Arial" w:cs="Arial"/>
+          <w:sz w:val="22"/>
+          <w:szCs w:val="22"/>
+          <w:lang w:val="en-US"/>
+        </w:rPr>
+        <w:t>.",</w:t>
+      </w:r>
+    </w:p>
+    <w:p>
+      <w:pPr>
+        <w:ind w:left="720"/>
+        <w:rPr>
+          <w:rFonts w:ascii="Arial" w:hAnsi="Arial" w:cs="Arial"/>
+          <w:sz w:val="22"/>
+          <w:szCs w:val="22"/>
+        </w:rPr>
+      </w:pPr>
+      <w:r>
+        <w:rPr>
+          <w:rFonts w:ascii="Arial" w:hAnsi="Arial" w:cs="Arial"/>
+          <w:sz w:val="22"/>
+          <w:szCs w:val="22"/>
+        </w:rPr>
+        <w:t xml:space="preserve"> - </w:t>
+      </w:r>
+      <w:r>
+        <w:rPr>
+          <w:rFonts w:ascii="Arial" w:hAnsi="Arial" w:cs="Arial"/>
+          <w:sz w:val="22"/>
+          <w:szCs w:val="22"/>
+        </w:rPr>
+        <w:t>"Una vez que hayas terminado de leer este texto, por favor, responde con un resumen en español. No olvides la puntuación y las reglas gramaticales.",</w:t>
+      </w:r>
+    </w:p>
+    <w:p>
+      <w:pPr>
+        <w:ind w:left="720"/>
+        <w:rPr>
+          <w:rFonts w:ascii="Arial" w:hAnsi="Arial" w:cs="Arial"/>
+          <w:sz w:val="22"/>
+          <w:szCs w:val="22"/>
+          <w:lang w:val="en-US"/>
+        </w:rPr>
+      </w:pPr>
+      <w:r>
+        <w:rPr>
+          <w:rFonts w:ascii="Arial" w:hAnsi="Arial" w:cs="Arial"/>
+          <w:sz w:val="22"/>
+          <w:szCs w:val="22"/>
+        </w:rPr>
+        <w:br/>
+      </w:r>
+      <w:r>
+        <w:rPr>
+          <w:rFonts w:ascii="Arial" w:hAnsi="Arial" w:cs="Arial"/>
+          <w:sz w:val="22"/>
+          <w:szCs w:val="22"/>
+          <w:lang w:val="en-US"/>
+        </w:rPr>
+        <w:drawing>
+          <wp:inline distT="0" distB="0" distL="0" distR="0" wp14:anchorId="64E45C60" wp14:editId="2DA26520">
+            <wp:extent cx="5612130" cy="2796540"/>
+            <wp:effectExtent l="0" t="0" r="7620" b="3810"/>
+            <wp:docPr id="201917007" name="Imagen 1"/>
+            <wp:cNvGraphicFramePr>
+              <a:graphicFrameLocks xmlns:a="http://schemas.openxmlformats.org/drawingml/2006/main" noChangeAspect="1"/>
+            </wp:cNvGraphicFramePr>
+            <a:graphic xmlns:a="http://schemas.openxmlformats.org/drawingml/2006/main">
+              <a:graphicData uri="http://schemas.openxmlformats.org/drawingml/2006/picture">
+                <pic:pic xmlns:pic="http://schemas.openxmlformats.org/drawingml/2006/picture">
+                  <pic:nvPicPr>
+                    <pic:cNvPr id="201917007" name=""/>
+                    <pic:cNvPicPr/>
+                  </pic:nvPicPr>
+                  <pic:blipFill>
+                    <a:blip r:embed="rId13"/>
+                    <a:stretch>
+                      <a:fillRect/>
+                    </a:stretch>
+                  </pic:blipFill>
+                  <pic:spPr>
+                    <a:xfrm>
+                      <a:off x="0" y="0"/>
+                      <a:ext cx="5612130" cy="2796540"/>
+                    </a:xfrm>
+                    <a:prstGeom prst="rect">
+                      <a:avLst/>
+                    </a:prstGeom>
+                  </pic:spPr>
+                </pic:pic>
+              </a:graphicData>
+            </a:graphic>
+          </wp:inline>
+        </w:drawing>
+      </w:r>
+    </w:p>
+    <w:p>
+      <w:pPr>
+        <w:rPr>
+          <w:rFonts w:ascii="Arial" w:hAnsi="Arial" w:cs="Arial"/>
+          <w:sz w:val="22"/>
+          <w:szCs w:val="22"/>
+          <w:lang w:val="en-US"/>
+        </w:rPr>
+      </w:pPr>
+      <w:r>
+        <w:rPr>
+          <w:rFonts w:ascii="Arial" w:hAnsi="Arial" w:cs="Arial"/>
+          <w:sz w:val="22"/>
+          <w:szCs w:val="22"/>
+          <w:lang w:val="en-US"/>
+        </w:rPr>
+        <w:t xml:space="preserve">The rule holds true well in simple medium-length sentences (Paris, ratio </w:t>
+      </w:r>
+      <w:r>
+        <w:rPr>
+          <w:rFonts w:ascii="Arial" w:hAnsi="Arial" w:cs="Arial"/>
+          <w:sz w:val="22"/>
+          <w:szCs w:val="22"/>
+          <w:lang w:val="en-US"/>
+        </w:rPr>
+        <w:t>3.88)</w:t>
+      </w:r>
+      <w:r>
+        <w:rPr>
+          <w:rFonts w:ascii="Arial" w:hAnsi="Arial" w:cs="Arial"/>
+          <w:sz w:val="22"/>
+          <w:szCs w:val="22"/>
+          <w:lang w:val="en-US"/>
+        </w:rPr>
+        <w:t xml:space="preserve"> the ideal case where the "1 token ≈ 4 characters" heuristic originated.</w:t>
+      </w:r>
+    </w:p>
+    <w:p>
+      <w:pPr>
+        <w:rPr>
+          <w:rFonts w:ascii="Arial" w:hAnsi="Arial" w:cs="Arial"/>
+          <w:sz w:val="22"/>
+          <w:szCs w:val="22"/>
+          <w:lang w:val="en-US"/>
+        </w:rPr>
+      </w:pPr>
+    </w:p>
+    <w:p>
+      <w:pPr>
+        <w:rPr>
+          <w:rFonts w:ascii="Arial" w:hAnsi="Arial" w:cs="Arial"/>
+          <w:sz w:val="22"/>
+          <w:szCs w:val="22"/>
+          <w:lang w:val="en-US"/>
+        </w:rPr>
+      </w:pPr>
+      <w:r>
+        <w:rPr>
+          <w:rFonts w:ascii="Arial" w:hAnsi="Arial" w:cs="Arial"/>
+          <w:sz w:val="22"/>
+          <w:szCs w:val="22"/>
+          <w:lang w:val="en-US"/>
+        </w:rPr>
+        <w:lastRenderedPageBreak/>
+        <w:t xml:space="preserve">It breaks down strongly in short text ("Hi!", ratio 1.00). Short texts have overhead: each short word and punctuation mark ("!") consumes its own full token; there is no "dilution" in longer text. The 4-character rule assumes average performance in long texts but fails in short messages (short system prompts, commands, </w:t>
+      </w:r>
+      <w:r>
+        <w:rPr>
+          <w:rFonts w:ascii="Arial" w:hAnsi="Arial" w:cs="Arial"/>
+          <w:sz w:val="22"/>
+          <w:szCs w:val="22"/>
+          <w:lang w:val="en-US"/>
+        </w:rPr>
+        <w:t>etc.</w:t>
+      </w:r>
+      <w:r>
+        <w:rPr>
+          <w:rFonts w:ascii="Arial" w:hAnsi="Arial" w:cs="Arial"/>
+          <w:sz w:val="22"/>
+          <w:szCs w:val="22"/>
+          <w:lang w:val="en-US"/>
+        </w:rPr>
+        <w:t xml:space="preserve"> important in real-world apps). It reverses in long technical text (ratio 5.56, above the rule). Common English words/repeated technical vocabulary ("Agentic", "orchestration", "framework") compress well because the BPE tokenizer already treats these </w:t>
+      </w:r>
+      <w:proofErr w:type="spellStart"/>
+      <w:r>
+        <w:rPr>
+          <w:rFonts w:ascii="Arial" w:hAnsi="Arial" w:cs="Arial"/>
+          <w:sz w:val="22"/>
+          <w:szCs w:val="22"/>
+          <w:lang w:val="en-US"/>
+        </w:rPr>
+        <w:t>subwords</w:t>
+      </w:r>
+      <w:proofErr w:type="spellEnd"/>
+      <w:r>
+        <w:rPr>
+          <w:rFonts w:ascii="Arial" w:hAnsi="Arial" w:cs="Arial"/>
+          <w:sz w:val="22"/>
+          <w:szCs w:val="22"/>
+          <w:lang w:val="en-US"/>
+        </w:rPr>
+        <w:t xml:space="preserve"> as frequent units</w:t>
+      </w:r>
+      <w:r>
+        <w:rPr>
+          <w:rFonts w:ascii="Arial" w:hAnsi="Arial" w:cs="Arial"/>
+          <w:sz w:val="22"/>
+          <w:szCs w:val="22"/>
+          <w:lang w:val="en-US"/>
+        </w:rPr>
+        <w:t>,</w:t>
+      </w:r>
+      <w:r>
+        <w:rPr>
+          <w:rFonts w:ascii="Arial" w:hAnsi="Arial" w:cs="Arial"/>
+          <w:sz w:val="22"/>
+          <w:szCs w:val="22"/>
+          <w:lang w:val="en-US"/>
+        </w:rPr>
+        <w:t xml:space="preserve"> more efficient than the rule predicts. Spanish comes close but falls short (4.42, not far from 4.0) accents, the letter ñ, and compound words add some cost, but not as dramatically as one might expect (modern tokenizers handle multi-language well).</w:t>
+      </w:r>
+    </w:p>
+    <w:p>
+      <w:pPr>
+        <w:rPr>
+          <w:rFonts w:ascii="Arial" w:hAnsi="Arial" w:cs="Arial"/>
+          <w:sz w:val="22"/>
+          <w:szCs w:val="22"/>
+          <w:lang w:val="en-US"/>
+        </w:rPr>
+      </w:pPr>
+      <w:r>
+        <w:rPr>
+          <w:rFonts w:ascii="Arial" w:hAnsi="Arial" w:cs="Arial"/>
+          <w:sz w:val="22"/>
+          <w:szCs w:val="22"/>
+          <w:lang w:val="en-US"/>
+        </w:rPr>
+        <w:t>The rule "1 token ≈ 4 characters" is a valid approximation only for average English in medium-length texts. It degrades at extremes (very short) and varies by language/vocabulary domain — relevant for budgeting costs/context limits in production; do not rely on a fixed rule.</w:t>
       </w:r>
     </w:p>
     <w:p>
@@ -909,50 +1620,1329 @@
         <w:pStyle w:val="Ttulo2"/>
         <w:rPr>
           <w:rFonts w:ascii="Arial" w:hAnsi="Arial" w:cs="Arial"/>
+          <w:b/>
+          <w:bCs/>
           <w:color w:val="auto"/>
           <w:sz w:val="24"/>
           <w:szCs w:val="24"/>
-          <w:lang w:val="es-419"/>
-        </w:rPr>
-      </w:pPr>
-      <w:proofErr w:type="spellStart"/>
-      <w:r>
-        <w:rPr>
-          <w:rFonts w:ascii="Arial" w:hAnsi="Arial" w:cs="Arial"/>
+          <w:lang w:val="en-US"/>
+        </w:rPr>
+      </w:pPr>
+      <w:r>
+        <w:rPr>
+          <w:rFonts w:ascii="Arial" w:hAnsi="Arial" w:cs="Arial"/>
+          <w:b/>
+          <w:bCs/>
           <w:color w:val="auto"/>
           <w:sz w:val="24"/>
           <w:szCs w:val="24"/>
-          <w:lang w:val="es-419"/>
-        </w:rPr>
-        <w:t>Activity</w:t>
+          <w:lang w:val="en-US"/>
+        </w:rPr>
+        <w:t>Activity 3</w:t>
+      </w:r>
+    </w:p>
+    <w:p>
+      <w:pPr>
+        <w:rPr>
+          <w:rFonts w:ascii="Arial" w:hAnsi="Arial" w:cs="Arial"/>
+          <w:sz w:val="22"/>
+          <w:szCs w:val="22"/>
+          <w:lang w:val="en-US"/>
+        </w:rPr>
+      </w:pPr>
+      <w:r>
+        <w:rPr>
+          <w:rFonts w:ascii="Arial" w:hAnsi="Arial" w:cs="Arial"/>
+          <w:sz w:val="22"/>
+          <w:szCs w:val="22"/>
+          <w:lang w:val="en-US"/>
+        </w:rPr>
+        <w:t xml:space="preserve">For this activity I just generate </w:t>
+      </w:r>
+      <w:proofErr w:type="gramStart"/>
+      <w:r>
+        <w:rPr>
+          <w:rFonts w:ascii="Arial" w:hAnsi="Arial" w:cs="Arial"/>
+          <w:sz w:val="22"/>
+          <w:szCs w:val="22"/>
+          <w:lang w:val="en-US"/>
+        </w:rPr>
+        <w:t>a 3 sentences</w:t>
+      </w:r>
+      <w:proofErr w:type="gramEnd"/>
+      <w:r>
+        <w:rPr>
+          <w:rFonts w:ascii="Arial" w:hAnsi="Arial" w:cs="Arial"/>
+          <w:sz w:val="22"/>
+          <w:szCs w:val="22"/>
+          <w:lang w:val="en-US"/>
+        </w:rPr>
+        <w:t xml:space="preserve"> with different </w:t>
+      </w:r>
+      <w:proofErr w:type="spellStart"/>
+      <w:r>
+        <w:rPr>
+          <w:rFonts w:ascii="Arial" w:hAnsi="Arial" w:cs="Arial"/>
+          <w:sz w:val="22"/>
+          <w:szCs w:val="22"/>
+          <w:lang w:val="en-US"/>
+        </w:rPr>
+        <w:t>tempeture</w:t>
       </w:r>
       <w:proofErr w:type="spellEnd"/>
       <w:r>
         <w:rPr>
           <w:rFonts w:ascii="Arial" w:hAnsi="Arial" w:cs="Arial"/>
+          <w:sz w:val="22"/>
+          <w:szCs w:val="22"/>
+          <w:lang w:val="en-US"/>
+        </w:rPr>
+        <w:t xml:space="preserve"> and </w:t>
+      </w:r>
+      <w:proofErr w:type="spellStart"/>
+      <w:r>
+        <w:rPr>
+          <w:rFonts w:ascii="Arial" w:hAnsi="Arial" w:cs="Arial"/>
+          <w:sz w:val="22"/>
+          <w:szCs w:val="22"/>
+          <w:lang w:val="en-US"/>
+        </w:rPr>
+        <w:t>top_p</w:t>
+      </w:r>
+      <w:proofErr w:type="spellEnd"/>
+      <w:r>
+        <w:rPr>
+          <w:rFonts w:ascii="Arial" w:hAnsi="Arial" w:cs="Arial"/>
+          <w:sz w:val="22"/>
+          <w:szCs w:val="22"/>
+          <w:lang w:val="en-US"/>
+        </w:rPr>
+        <w:t xml:space="preserve"> and mixed to get the 3 sentences in different order</w:t>
+      </w:r>
+    </w:p>
+    <w:p>
+      <w:pPr>
+        <w:rPr>
+          <w:rFonts w:ascii="Arial" w:hAnsi="Arial" w:cs="Arial"/>
+          <w:sz w:val="22"/>
+          <w:szCs w:val="22"/>
+          <w:lang w:val="en-US"/>
+        </w:rPr>
+      </w:pPr>
+      <w:r>
+        <w:rPr>
+          <w:rFonts w:ascii="Arial" w:hAnsi="Arial" w:cs="Arial"/>
+          <w:sz w:val="22"/>
+          <w:szCs w:val="22"/>
+          <w:lang w:val="en-US"/>
+        </w:rPr>
+        <w:lastRenderedPageBreak/>
+        <w:drawing>
+          <wp:inline distT="0" distB="0" distL="0" distR="0" wp14:anchorId="7A8E1D38" wp14:editId="7BDEA9DB">
+            <wp:extent cx="5612130" cy="4944745"/>
+            <wp:effectExtent l="0" t="0" r="7620" b="8255"/>
+            <wp:docPr id="550357310" name="Imagen 1"/>
+            <wp:cNvGraphicFramePr>
+              <a:graphicFrameLocks xmlns:a="http://schemas.openxmlformats.org/drawingml/2006/main" noChangeAspect="1"/>
+            </wp:cNvGraphicFramePr>
+            <a:graphic xmlns:a="http://schemas.openxmlformats.org/drawingml/2006/main">
+              <a:graphicData uri="http://schemas.openxmlformats.org/drawingml/2006/picture">
+                <pic:pic xmlns:pic="http://schemas.openxmlformats.org/drawingml/2006/picture">
+                  <pic:nvPicPr>
+                    <pic:cNvPr id="550357310" name=""/>
+                    <pic:cNvPicPr/>
+                  </pic:nvPicPr>
+                  <pic:blipFill>
+                    <a:blip r:embed="rId14"/>
+                    <a:stretch>
+                      <a:fillRect/>
+                    </a:stretch>
+                  </pic:blipFill>
+                  <pic:spPr>
+                    <a:xfrm>
+                      <a:off x="0" y="0"/>
+                      <a:ext cx="5612130" cy="4944745"/>
+                    </a:xfrm>
+                    <a:prstGeom prst="rect">
+                      <a:avLst/>
+                    </a:prstGeom>
+                  </pic:spPr>
+                </pic:pic>
+              </a:graphicData>
+            </a:graphic>
+          </wp:inline>
+        </w:drawing>
+      </w:r>
+    </w:p>
+    <w:p>
+      <w:pPr>
+        <w:rPr>
+          <w:rFonts w:ascii="Arial" w:hAnsi="Arial" w:cs="Arial"/>
+          <w:sz w:val="22"/>
+          <w:szCs w:val="22"/>
+          <w:lang w:val="en-US"/>
+        </w:rPr>
+      </w:pPr>
+      <w:r>
+        <w:rPr>
+          <w:rFonts w:ascii="Arial" w:hAnsi="Arial" w:cs="Arial"/>
+          <w:sz w:val="22"/>
+          <w:szCs w:val="22"/>
+          <w:lang w:val="en-US"/>
+        </w:rPr>
+        <w:t xml:space="preserve">Later I just ask for an AI to construct one algorithm that throw me the phrase with the </w:t>
+      </w:r>
+      <w:proofErr w:type="spellStart"/>
+      <w:r>
+        <w:rPr>
+          <w:rFonts w:ascii="Arial" w:hAnsi="Arial" w:cs="Arial"/>
+          <w:sz w:val="22"/>
+          <w:szCs w:val="22"/>
+          <w:lang w:val="en-US"/>
+        </w:rPr>
+        <w:t>tempeture</w:t>
+      </w:r>
+      <w:proofErr w:type="spellEnd"/>
+      <w:r>
+        <w:rPr>
+          <w:rFonts w:ascii="Arial" w:hAnsi="Arial" w:cs="Arial"/>
+          <w:sz w:val="22"/>
+          <w:szCs w:val="22"/>
+          <w:lang w:val="en-US"/>
+        </w:rPr>
+        <w:t xml:space="preserve"> and </w:t>
+      </w:r>
+      <w:proofErr w:type="spellStart"/>
+      <w:r>
+        <w:rPr>
+          <w:rFonts w:ascii="Arial" w:hAnsi="Arial" w:cs="Arial"/>
+          <w:sz w:val="22"/>
+          <w:szCs w:val="22"/>
+          <w:lang w:val="en-US"/>
+        </w:rPr>
+        <w:t>top_p</w:t>
+      </w:r>
+      <w:proofErr w:type="spellEnd"/>
+      <w:r>
+        <w:rPr>
+          <w:rFonts w:ascii="Arial" w:hAnsi="Arial" w:cs="Arial"/>
+          <w:sz w:val="22"/>
+          <w:szCs w:val="22"/>
+          <w:lang w:val="en-US"/>
+        </w:rPr>
+        <w:t xml:space="preserve">. </w:t>
+      </w:r>
+      <w:proofErr w:type="gramStart"/>
+      <w:r>
+        <w:rPr>
+          <w:rFonts w:ascii="Arial" w:hAnsi="Arial" w:cs="Arial"/>
+          <w:sz w:val="22"/>
+          <w:szCs w:val="22"/>
+          <w:lang w:val="en-US"/>
+        </w:rPr>
+        <w:t>Also</w:t>
+      </w:r>
+      <w:proofErr w:type="gramEnd"/>
+      <w:r>
+        <w:rPr>
+          <w:rFonts w:ascii="Arial" w:hAnsi="Arial" w:cs="Arial"/>
+          <w:sz w:val="22"/>
+          <w:szCs w:val="22"/>
+          <w:lang w:val="en-US"/>
+        </w:rPr>
+        <w:t xml:space="preserve"> this algorithm </w:t>
+      </w:r>
+      <w:proofErr w:type="gramStart"/>
+      <w:r>
+        <w:rPr>
+          <w:rFonts w:ascii="Arial" w:hAnsi="Arial" w:cs="Arial"/>
+          <w:sz w:val="22"/>
+          <w:szCs w:val="22"/>
+          <w:lang w:val="en-US"/>
+        </w:rPr>
+        <w:t>organize</w:t>
+      </w:r>
+      <w:proofErr w:type="gramEnd"/>
+      <w:r>
+        <w:rPr>
+          <w:rFonts w:ascii="Arial" w:hAnsi="Arial" w:cs="Arial"/>
+          <w:sz w:val="22"/>
+          <w:szCs w:val="22"/>
+          <w:lang w:val="en-US"/>
+        </w:rPr>
+        <w:t xml:space="preserve"> the dictionary and give me the answer like you see on the below image</w:t>
+      </w:r>
+      <w:r>
+        <w:rPr>
+          <w:rFonts w:ascii="Arial" w:hAnsi="Arial" w:cs="Arial"/>
+          <w:sz w:val="22"/>
+          <w:szCs w:val="22"/>
+          <w:lang w:val="en-US"/>
+        </w:rPr>
+        <w:br/>
+      </w:r>
+      <w:r>
+        <w:rPr>
+          <w:rFonts w:ascii="Arial" w:hAnsi="Arial" w:cs="Arial"/>
+          <w:sz w:val="22"/>
+          <w:szCs w:val="22"/>
+          <w:lang w:val="en-US"/>
+        </w:rPr>
+        <w:drawing>
+          <wp:inline distT="0" distB="0" distL="0" distR="0" wp14:anchorId="5E983DDD" wp14:editId="77987B67">
+            <wp:extent cx="5612130" cy="2543810"/>
+            <wp:effectExtent l="0" t="0" r="7620" b="8890"/>
+            <wp:docPr id="1616889929" name="Imagen 1"/>
+            <wp:cNvGraphicFramePr>
+              <a:graphicFrameLocks xmlns:a="http://schemas.openxmlformats.org/drawingml/2006/main" noChangeAspect="1"/>
+            </wp:cNvGraphicFramePr>
+            <a:graphic xmlns:a="http://schemas.openxmlformats.org/drawingml/2006/main">
+              <a:graphicData uri="http://schemas.openxmlformats.org/drawingml/2006/picture">
+                <pic:pic xmlns:pic="http://schemas.openxmlformats.org/drawingml/2006/picture">
+                  <pic:nvPicPr>
+                    <pic:cNvPr id="1616889929" name=""/>
+                    <pic:cNvPicPr/>
+                  </pic:nvPicPr>
+                  <pic:blipFill>
+                    <a:blip r:embed="rId15"/>
+                    <a:stretch>
+                      <a:fillRect/>
+                    </a:stretch>
+                  </pic:blipFill>
+                  <pic:spPr>
+                    <a:xfrm>
+                      <a:off x="0" y="0"/>
+                      <a:ext cx="5612130" cy="2543810"/>
+                    </a:xfrm>
+                    <a:prstGeom prst="rect">
+                      <a:avLst/>
+                    </a:prstGeom>
+                  </pic:spPr>
+                </pic:pic>
+              </a:graphicData>
+            </a:graphic>
+          </wp:inline>
+        </w:drawing>
+      </w:r>
+    </w:p>
+    <w:p>
+      <w:pPr>
+        <w:rPr>
+          <w:rFonts w:ascii="Arial" w:hAnsi="Arial" w:cs="Arial"/>
+          <w:sz w:val="22"/>
+          <w:szCs w:val="22"/>
+          <w:lang w:val="en-US"/>
+        </w:rPr>
+      </w:pPr>
+      <w:r>
+        <w:rPr>
+          <w:rFonts w:ascii="Arial" w:hAnsi="Arial" w:cs="Arial"/>
+          <w:sz w:val="22"/>
+          <w:szCs w:val="22"/>
+          <w:lang w:val="en-US"/>
+        </w:rPr>
+        <w:lastRenderedPageBreak/>
+        <w:t xml:space="preserve">Output C (temp=0.0, </w:t>
+      </w:r>
+      <w:proofErr w:type="spellStart"/>
+      <w:r>
+        <w:rPr>
+          <w:rFonts w:ascii="Arial" w:hAnsi="Arial" w:cs="Arial"/>
+          <w:sz w:val="22"/>
+          <w:szCs w:val="22"/>
+          <w:lang w:val="en-US"/>
+        </w:rPr>
+        <w:t>top_p</w:t>
+      </w:r>
+      <w:proofErr w:type="spellEnd"/>
+      <w:r>
+        <w:rPr>
+          <w:rFonts w:ascii="Arial" w:hAnsi="Arial" w:cs="Arial"/>
+          <w:sz w:val="22"/>
+          <w:szCs w:val="22"/>
+          <w:lang w:val="en-US"/>
+        </w:rPr>
+        <w:t xml:space="preserve">=0.1): Highly peaked distribution — the model almost always chooses the most probable token; sampling has very little room to vary. Generic/abstract text ("quiet possibility... between the") is a typical marker of low temperature: safe but bland. </w:t>
+      </w:r>
+    </w:p>
+    <w:p>
+      <w:pPr>
+        <w:rPr>
+          <w:rFonts w:ascii="Arial" w:hAnsi="Arial" w:cs="Arial"/>
+          <w:sz w:val="22"/>
+          <w:szCs w:val="22"/>
+          <w:lang w:val="en-US"/>
+        </w:rPr>
+      </w:pPr>
+      <w:r>
+        <w:rPr>
+          <w:rFonts w:ascii="Arial" w:hAnsi="Arial" w:cs="Arial"/>
+          <w:sz w:val="22"/>
+          <w:szCs w:val="22"/>
+          <w:lang w:val="en-US"/>
+        </w:rPr>
+        <w:t xml:space="preserve">Output A (temp=0.7, </w:t>
+      </w:r>
+      <w:proofErr w:type="spellStart"/>
+      <w:r>
+        <w:rPr>
+          <w:rFonts w:ascii="Arial" w:hAnsi="Arial" w:cs="Arial"/>
+          <w:sz w:val="22"/>
+          <w:szCs w:val="22"/>
+          <w:lang w:val="en-US"/>
+        </w:rPr>
+        <w:t>top_p</w:t>
+      </w:r>
+      <w:proofErr w:type="spellEnd"/>
+      <w:r>
+        <w:rPr>
+          <w:rFonts w:ascii="Arial" w:hAnsi="Arial" w:cs="Arial"/>
+          <w:sz w:val="22"/>
+          <w:szCs w:val="22"/>
+          <w:lang w:val="en-US"/>
+        </w:rPr>
+        <w:t>=0.9): Moderately open distribution; the nucleus (</w:t>
+      </w:r>
+      <w:proofErr w:type="spellStart"/>
+      <w:r>
+        <w:rPr>
+          <w:rFonts w:ascii="Arial" w:hAnsi="Arial" w:cs="Arial"/>
+          <w:sz w:val="22"/>
+          <w:szCs w:val="22"/>
+          <w:lang w:val="en-US"/>
+        </w:rPr>
+        <w:t>top_p</w:t>
+      </w:r>
+      <w:proofErr w:type="spellEnd"/>
+      <w:r>
+        <w:rPr>
+          <w:rFonts w:ascii="Arial" w:hAnsi="Arial" w:cs="Arial"/>
+          <w:sz w:val="22"/>
+          <w:szCs w:val="22"/>
+          <w:lang w:val="en-US"/>
+        </w:rPr>
+        <w:t xml:space="preserve">=0.9) allows quite a few candidates to pass, but not all. Result: coherent, with an odd touch (the stray colon at the </w:t>
+      </w:r>
+      <w:r>
+        <w:rPr>
+          <w:rFonts w:ascii="Arial" w:hAnsi="Arial" w:cs="Arial"/>
+          <w:sz w:val="22"/>
+          <w:szCs w:val="22"/>
+          <w:lang w:val="en-US"/>
+        </w:rPr>
+        <w:t>beginning)</w:t>
+      </w:r>
+      <w:r>
+        <w:rPr>
+          <w:rFonts w:ascii="Arial" w:hAnsi="Arial" w:cs="Arial"/>
+          <w:sz w:val="22"/>
+          <w:szCs w:val="22"/>
+          <w:lang w:val="en-US"/>
+        </w:rPr>
+        <w:t xml:space="preserve"> a sign that sampling has already deviated slightly from the most probable path, but without breaking the structure. </w:t>
+      </w:r>
+    </w:p>
+    <w:p>
+      <w:pPr>
+        <w:rPr>
+          <w:rFonts w:ascii="Arial" w:hAnsi="Arial" w:cs="Arial"/>
+          <w:sz w:val="22"/>
+          <w:szCs w:val="22"/>
+          <w:lang w:val="en-US"/>
+        </w:rPr>
+      </w:pPr>
+      <w:r>
+        <w:rPr>
+          <w:rFonts w:ascii="Arial" w:hAnsi="Arial" w:cs="Arial"/>
+          <w:sz w:val="22"/>
+          <w:szCs w:val="22"/>
+          <w:lang w:val="en-US"/>
+        </w:rPr>
+        <w:t xml:space="preserve">Output B (temp=1.4, </w:t>
+      </w:r>
+      <w:proofErr w:type="spellStart"/>
+      <w:r>
+        <w:rPr>
+          <w:rFonts w:ascii="Arial" w:hAnsi="Arial" w:cs="Arial"/>
+          <w:sz w:val="22"/>
+          <w:szCs w:val="22"/>
+          <w:lang w:val="en-US"/>
+        </w:rPr>
+        <w:t>top_p</w:t>
+      </w:r>
+      <w:proofErr w:type="spellEnd"/>
+      <w:r>
+        <w:rPr>
+          <w:rFonts w:ascii="Arial" w:hAnsi="Arial" w:cs="Arial"/>
+          <w:sz w:val="22"/>
+          <w:szCs w:val="22"/>
+          <w:lang w:val="en-US"/>
+        </w:rPr>
+        <w:t xml:space="preserve">=1.0): Flat distribution; </w:t>
+      </w:r>
+      <w:proofErr w:type="spellStart"/>
+      <w:r>
+        <w:rPr>
+          <w:rFonts w:ascii="Arial" w:hAnsi="Arial" w:cs="Arial"/>
+          <w:sz w:val="22"/>
+          <w:szCs w:val="22"/>
+          <w:lang w:val="en-US"/>
+        </w:rPr>
+        <w:t>top_p</w:t>
+      </w:r>
+      <w:proofErr w:type="spellEnd"/>
+      <w:r>
+        <w:rPr>
+          <w:rFonts w:ascii="Arial" w:hAnsi="Arial" w:cs="Arial"/>
+          <w:sz w:val="22"/>
+          <w:szCs w:val="22"/>
+          <w:lang w:val="en-US"/>
+        </w:rPr>
+        <w:t>=1.0 doesn't clip anything; high temperature flattens the probabilities even further. More "poetic"/unexpected text (rare combination "rain and burnt toast... sudden silence"), less obvious juxtaposition a marker of almost unrestricted sampling.</w:t>
+      </w:r>
+    </w:p>
+    <w:p>
+      <w:pPr>
+        <w:rPr>
+          <w:rFonts w:ascii="Arial" w:hAnsi="Arial" w:cs="Arial"/>
+          <w:lang w:val="en-US"/>
+        </w:rPr>
+      </w:pPr>
+    </w:p>
+    <w:p>
+      <w:pPr>
+        <w:pStyle w:val="Ttulo2"/>
+        <w:rPr>
+          <w:rFonts w:ascii="Arial" w:hAnsi="Arial" w:cs="Arial"/>
+          <w:b/>
+          <w:bCs/>
           <w:color w:val="auto"/>
           <w:sz w:val="24"/>
           <w:szCs w:val="24"/>
-          <w:lang w:val="es-419"/>
-        </w:rPr>
-        <w:t xml:space="preserve"> </w:t>
-      </w:r>
-      <w:r>
-        <w:rPr>
-          <w:rFonts w:ascii="Arial" w:hAnsi="Arial" w:cs="Arial"/>
+          <w:lang w:val="en-US"/>
+        </w:rPr>
+      </w:pPr>
+      <w:r>
+        <w:rPr>
+          <w:rFonts w:ascii="Arial" w:hAnsi="Arial" w:cs="Arial"/>
+          <w:b/>
+          <w:bCs/>
           <w:color w:val="auto"/>
           <w:sz w:val="24"/>
           <w:szCs w:val="24"/>
-          <w:lang w:val="es-419"/>
-        </w:rPr>
-        <w:t>3</w:t>
-      </w:r>
-    </w:p>
-    <w:p>
-      <w:pPr>
-        <w:rPr>
-          <w:rFonts w:ascii="Arial" w:hAnsi="Arial" w:cs="Arial"/>
-          <w:lang w:val="es-419"/>
+          <w:lang w:val="en-US"/>
+        </w:rPr>
+        <w:t>Activity 4</w:t>
+      </w:r>
+    </w:p>
+    <w:p>
+      <w:pPr>
+        <w:rPr>
+          <w:rFonts w:ascii="Arial" w:hAnsi="Arial" w:cs="Arial"/>
+          <w:lang w:val="en-US"/>
+        </w:rPr>
+      </w:pPr>
+      <w:r>
+        <w:rPr>
+          <w:rFonts w:ascii="Arial" w:hAnsi="Arial" w:cs="Arial"/>
+          <w:lang w:val="en-US"/>
+        </w:rPr>
+        <w:t xml:space="preserve">For this part I just change the prompt because I just want </w:t>
+      </w:r>
+      <w:proofErr w:type="spellStart"/>
+      <w:r>
+        <w:rPr>
+          <w:rFonts w:ascii="Arial" w:hAnsi="Arial" w:cs="Arial"/>
+          <w:lang w:val="en-US"/>
+        </w:rPr>
+        <w:t>kwno</w:t>
+      </w:r>
+      <w:proofErr w:type="spellEnd"/>
+      <w:r>
+        <w:rPr>
+          <w:rFonts w:ascii="Arial" w:hAnsi="Arial" w:cs="Arial"/>
+          <w:lang w:val="en-US"/>
+        </w:rPr>
+        <w:t xml:space="preserve"> about </w:t>
+      </w:r>
+      <w:r>
+        <w:rPr>
+          <w:rFonts w:ascii="Arial" w:hAnsi="Arial" w:cs="Arial"/>
+          <w:lang w:val="en-US"/>
+        </w:rPr>
+        <w:t>physicist</w:t>
+      </w:r>
+      <w:r>
+        <w:rPr>
+          <w:rFonts w:ascii="Arial" w:hAnsi="Arial" w:cs="Arial"/>
+          <w:lang w:val="en-US"/>
+        </w:rPr>
+        <w:t>, the new prompt used was “</w:t>
+      </w:r>
+      <w:r>
+        <w:rPr>
+          <w:rFonts w:ascii="Arial" w:hAnsi="Arial" w:cs="Arial"/>
+          <w:lang w:val="en-US"/>
+        </w:rPr>
+        <w:t>Name one famous physicist and the discovery they're best known for.</w:t>
+      </w:r>
+      <w:r>
+        <w:rPr>
+          <w:rFonts w:ascii="Arial" w:hAnsi="Arial" w:cs="Arial"/>
+          <w:lang w:val="en-US"/>
+        </w:rPr>
+        <w:t xml:space="preserve">” Later I execute </w:t>
+      </w:r>
+      <w:proofErr w:type="gramStart"/>
+      <w:r>
+        <w:rPr>
+          <w:rFonts w:ascii="Arial" w:hAnsi="Arial" w:cs="Arial"/>
+          <w:lang w:val="en-US"/>
+        </w:rPr>
+        <w:t>all of</w:t>
+      </w:r>
+      <w:proofErr w:type="gramEnd"/>
+      <w:r>
+        <w:rPr>
+          <w:rFonts w:ascii="Arial" w:hAnsi="Arial" w:cs="Arial"/>
+          <w:lang w:val="en-US"/>
+        </w:rPr>
+        <w:t xml:space="preserve"> the 3 different </w:t>
+      </w:r>
+      <w:r>
+        <w:rPr>
+          <w:rFonts w:ascii="Arial" w:hAnsi="Arial" w:cs="Arial"/>
+          <w:lang w:val="en-US"/>
+        </w:rPr>
+        <w:t>forms to ask at LLM like you see on the images below</w:t>
+      </w:r>
+      <w:r>
+        <w:rPr>
+          <w:rFonts w:ascii="Arial" w:hAnsi="Arial" w:cs="Arial"/>
+          <w:lang w:val="en-US"/>
+        </w:rPr>
+        <w:br/>
+      </w:r>
+      <w:r>
+        <w:rPr>
+          <w:rFonts w:ascii="Arial" w:hAnsi="Arial" w:cs="Arial"/>
+          <w:lang w:val="en-US"/>
+        </w:rPr>
+        <w:drawing>
+          <wp:inline distT="0" distB="0" distL="0" distR="0" wp14:anchorId="1C98E28B" wp14:editId="5F5B5D7E">
+            <wp:extent cx="5612130" cy="1628775"/>
+            <wp:effectExtent l="0" t="0" r="7620" b="9525"/>
+            <wp:docPr id="906536268" name="Imagen 1"/>
+            <wp:cNvGraphicFramePr>
+              <a:graphicFrameLocks xmlns:a="http://schemas.openxmlformats.org/drawingml/2006/main" noChangeAspect="1"/>
+            </wp:cNvGraphicFramePr>
+            <a:graphic xmlns:a="http://schemas.openxmlformats.org/drawingml/2006/main">
+              <a:graphicData uri="http://schemas.openxmlformats.org/drawingml/2006/picture">
+                <pic:pic xmlns:pic="http://schemas.openxmlformats.org/drawingml/2006/picture">
+                  <pic:nvPicPr>
+                    <pic:cNvPr id="906536268" name=""/>
+                    <pic:cNvPicPr/>
+                  </pic:nvPicPr>
+                  <pic:blipFill>
+                    <a:blip r:embed="rId16"/>
+                    <a:stretch>
+                      <a:fillRect/>
+                    </a:stretch>
+                  </pic:blipFill>
+                  <pic:spPr>
+                    <a:xfrm>
+                      <a:off x="0" y="0"/>
+                      <a:ext cx="5612130" cy="1628775"/>
+                    </a:xfrm>
+                    <a:prstGeom prst="rect">
+                      <a:avLst/>
+                    </a:prstGeom>
+                  </pic:spPr>
+                </pic:pic>
+              </a:graphicData>
+            </a:graphic>
+          </wp:inline>
+        </w:drawing>
+      </w:r>
+    </w:p>
+    <w:p>
+      <w:pPr>
+        <w:rPr>
+          <w:rFonts w:ascii="Arial" w:hAnsi="Arial" w:cs="Arial"/>
+          <w:i/>
+          <w:iCs/>
+          <w:sz w:val="22"/>
+          <w:szCs w:val="22"/>
+          <w:lang w:val="en-US"/>
+        </w:rPr>
+      </w:pPr>
+      <w:r>
+        <w:rPr>
+          <w:rFonts w:ascii="Arial" w:hAnsi="Arial" w:cs="Arial"/>
+          <w:b/>
+          <w:bCs/>
+          <w:sz w:val="22"/>
+          <w:szCs w:val="22"/>
+          <w:lang w:val="en-US"/>
+        </w:rPr>
+        <w:t>LLM Responses:</w:t>
+      </w:r>
+      <w:r>
+        <w:rPr>
+          <w:rFonts w:ascii="Arial" w:hAnsi="Arial" w:cs="Arial"/>
+          <w:sz w:val="22"/>
+          <w:szCs w:val="22"/>
+          <w:lang w:val="en-US"/>
+        </w:rPr>
+        <w:t xml:space="preserve"> </w:t>
+      </w:r>
+      <w:r>
+        <w:rPr>
+          <w:rFonts w:ascii="Arial" w:hAnsi="Arial" w:cs="Arial"/>
+          <w:i/>
+          <w:iCs/>
+          <w:sz w:val="22"/>
+          <w:szCs w:val="22"/>
+          <w:lang w:val="en-US"/>
+        </w:rPr>
+        <w:t>“</w:t>
+      </w:r>
+      <w:r>
+        <w:rPr>
+          <w:rFonts w:ascii="Arial" w:hAnsi="Arial" w:cs="Arial"/>
+          <w:i/>
+          <w:iCs/>
+          <w:sz w:val="22"/>
+          <w:szCs w:val="22"/>
+          <w:lang w:val="en-US"/>
+        </w:rPr>
+        <w:t>A) raw SDK:</w:t>
+      </w:r>
+    </w:p>
+    <w:p>
+      <w:pPr>
+        <w:rPr>
+          <w:rFonts w:ascii="Arial" w:hAnsi="Arial" w:cs="Arial"/>
+          <w:i/>
+          <w:iCs/>
+          <w:sz w:val="22"/>
+          <w:szCs w:val="22"/>
+          <w:lang w:val="en-US"/>
+        </w:rPr>
+      </w:pPr>
+      <w:r>
+        <w:rPr>
+          <w:rFonts w:ascii="Arial" w:hAnsi="Arial" w:cs="Arial"/>
+          <w:i/>
+          <w:iCs/>
+          <w:sz w:val="22"/>
+          <w:szCs w:val="22"/>
+          <w:lang w:val="en-US"/>
+        </w:rPr>
+        <w:t xml:space="preserve"> **Albert Einstein**, who is best known for developing the **Theory of General Relativity**, which fundamentally changed our understanding of gravity, space, and time</w:t>
+      </w:r>
+      <w:r>
+        <w:rPr>
+          <w:rFonts w:ascii="Arial" w:hAnsi="Arial" w:cs="Arial"/>
+          <w:i/>
+          <w:iCs/>
+          <w:sz w:val="22"/>
+          <w:szCs w:val="22"/>
+          <w:lang w:val="en-US"/>
+        </w:rPr>
+        <w:t>.”</w:t>
+      </w:r>
+    </w:p>
+    <w:p>
+      <w:pPr>
+        <w:rPr>
+          <w:rFonts w:ascii="Arial" w:hAnsi="Arial" w:cs="Arial"/>
+          <w:lang w:val="en-US"/>
+        </w:rPr>
+      </w:pPr>
+      <w:r>
+        <w:rPr>
+          <w:rFonts w:ascii="Arial" w:hAnsi="Arial" w:cs="Arial"/>
+          <w:lang w:val="en-US"/>
+        </w:rPr>
+        <w:lastRenderedPageBreak/>
+        <w:drawing>
+          <wp:inline distT="0" distB="0" distL="0" distR="0" wp14:anchorId="2EB52E95" wp14:editId="4DBC3485">
+            <wp:extent cx="5612130" cy="3771900"/>
+            <wp:effectExtent l="0" t="0" r="7620" b="0"/>
+            <wp:docPr id="1702329334" name="Imagen 1"/>
+            <wp:cNvGraphicFramePr>
+              <a:graphicFrameLocks xmlns:a="http://schemas.openxmlformats.org/drawingml/2006/main" noChangeAspect="1"/>
+            </wp:cNvGraphicFramePr>
+            <a:graphic xmlns:a="http://schemas.openxmlformats.org/drawingml/2006/main">
+              <a:graphicData uri="http://schemas.openxmlformats.org/drawingml/2006/picture">
+                <pic:pic xmlns:pic="http://schemas.openxmlformats.org/drawingml/2006/picture">
+                  <pic:nvPicPr>
+                    <pic:cNvPr id="1702329334" name=""/>
+                    <pic:cNvPicPr/>
+                  </pic:nvPicPr>
+                  <pic:blipFill>
+                    <a:blip r:embed="rId17"/>
+                    <a:stretch>
+                      <a:fillRect/>
+                    </a:stretch>
+                  </pic:blipFill>
+                  <pic:spPr>
+                    <a:xfrm>
+                      <a:off x="0" y="0"/>
+                      <a:ext cx="5612130" cy="3771900"/>
+                    </a:xfrm>
+                    <a:prstGeom prst="rect">
+                      <a:avLst/>
+                    </a:prstGeom>
+                  </pic:spPr>
+                </pic:pic>
+              </a:graphicData>
+            </a:graphic>
+          </wp:inline>
+        </w:drawing>
+      </w:r>
+    </w:p>
+    <w:p>
+      <w:pPr>
+        <w:rPr>
+          <w:rFonts w:ascii="Arial" w:hAnsi="Arial" w:cs="Arial"/>
+          <w:i/>
+          <w:iCs/>
+          <w:sz w:val="22"/>
+          <w:szCs w:val="22"/>
+          <w:lang w:val="en-US"/>
+        </w:rPr>
+      </w:pPr>
+      <w:r>
+        <w:rPr>
+          <w:rFonts w:ascii="Arial" w:hAnsi="Arial" w:cs="Arial"/>
+          <w:b/>
+          <w:bCs/>
+          <w:sz w:val="22"/>
+          <w:szCs w:val="22"/>
+          <w:lang w:val="en-US"/>
+        </w:rPr>
+        <w:t>LLM Responses:</w:t>
+      </w:r>
+      <w:r>
+        <w:rPr>
+          <w:rFonts w:ascii="Arial" w:hAnsi="Arial" w:cs="Arial"/>
+          <w:sz w:val="22"/>
+          <w:szCs w:val="22"/>
+          <w:lang w:val="en-US"/>
+        </w:rPr>
+        <w:t xml:space="preserve"> </w:t>
+      </w:r>
+      <w:r>
+        <w:rPr>
+          <w:rFonts w:ascii="Arial" w:hAnsi="Arial" w:cs="Arial"/>
+          <w:i/>
+          <w:iCs/>
+          <w:sz w:val="22"/>
+          <w:szCs w:val="22"/>
+          <w:lang w:val="en-US"/>
+        </w:rPr>
+        <w:t>“</w:t>
+      </w:r>
+      <w:r>
+        <w:rPr>
+          <w:rFonts w:ascii="Arial" w:hAnsi="Arial" w:cs="Arial"/>
+          <w:i/>
+          <w:iCs/>
+          <w:sz w:val="22"/>
+          <w:szCs w:val="22"/>
+          <w:lang w:val="en-US"/>
+        </w:rPr>
+        <w:t>B) Google ADK agent:</w:t>
+      </w:r>
+    </w:p>
+    <w:p>
+      <w:pPr>
+        <w:rPr>
+          <w:rFonts w:ascii="Arial" w:hAnsi="Arial" w:cs="Arial"/>
+          <w:i/>
+          <w:iCs/>
+          <w:sz w:val="22"/>
+          <w:szCs w:val="22"/>
+          <w:lang w:val="en-US"/>
+        </w:rPr>
+      </w:pPr>
+      <w:r>
+        <w:rPr>
+          <w:rFonts w:ascii="Arial" w:hAnsi="Arial" w:cs="Arial"/>
+          <w:i/>
+          <w:iCs/>
+          <w:sz w:val="22"/>
+          <w:szCs w:val="22"/>
+          <w:lang w:val="en-US"/>
+        </w:rPr>
+        <w:t xml:space="preserve"> Albert Einstein is best known for developing the theory of relativity, which fundamentally revolutionized our understanding of space, time, and gravity.</w:t>
+      </w:r>
+      <w:r>
+        <w:rPr>
+          <w:rFonts w:ascii="Arial" w:hAnsi="Arial" w:cs="Arial"/>
+          <w:i/>
+          <w:iCs/>
+          <w:sz w:val="22"/>
+          <w:szCs w:val="22"/>
+          <w:lang w:val="en-US"/>
+        </w:rPr>
+        <w:t>”</w:t>
+      </w:r>
+    </w:p>
+    <w:p>
+      <w:pPr>
+        <w:rPr>
+          <w:rFonts w:ascii="Arial" w:hAnsi="Arial" w:cs="Arial"/>
+          <w:i/>
+          <w:iCs/>
+          <w:sz w:val="22"/>
+          <w:szCs w:val="22"/>
+          <w:lang w:val="en-US"/>
+        </w:rPr>
+      </w:pPr>
+      <w:r>
+        <w:rPr>
+          <w:rFonts w:ascii="Arial" w:hAnsi="Arial" w:cs="Arial"/>
+          <w:i/>
+          <w:iCs/>
+          <w:sz w:val="22"/>
+          <w:szCs w:val="22"/>
+          <w:lang w:val="en-US"/>
+        </w:rPr>
+        <w:drawing>
+          <wp:inline distT="0" distB="0" distL="0" distR="0" wp14:anchorId="59E8DDC3" wp14:editId="2DB3C08F">
+            <wp:extent cx="5612130" cy="1697355"/>
+            <wp:effectExtent l="0" t="0" r="7620" b="0"/>
+            <wp:docPr id="521025463" name="Imagen 1"/>
+            <wp:cNvGraphicFramePr>
+              <a:graphicFrameLocks xmlns:a="http://schemas.openxmlformats.org/drawingml/2006/main" noChangeAspect="1"/>
+            </wp:cNvGraphicFramePr>
+            <a:graphic xmlns:a="http://schemas.openxmlformats.org/drawingml/2006/main">
+              <a:graphicData uri="http://schemas.openxmlformats.org/drawingml/2006/picture">
+                <pic:pic xmlns:pic="http://schemas.openxmlformats.org/drawingml/2006/picture">
+                  <pic:nvPicPr>
+                    <pic:cNvPr id="521025463" name=""/>
+                    <pic:cNvPicPr/>
+                  </pic:nvPicPr>
+                  <pic:blipFill>
+                    <a:blip r:embed="rId18"/>
+                    <a:stretch>
+                      <a:fillRect/>
+                    </a:stretch>
+                  </pic:blipFill>
+                  <pic:spPr>
+                    <a:xfrm>
+                      <a:off x="0" y="0"/>
+                      <a:ext cx="5612130" cy="1697355"/>
+                    </a:xfrm>
+                    <a:prstGeom prst="rect">
+                      <a:avLst/>
+                    </a:prstGeom>
+                  </pic:spPr>
+                </pic:pic>
+              </a:graphicData>
+            </a:graphic>
+          </wp:inline>
+        </w:drawing>
+      </w:r>
+    </w:p>
+    <w:p>
+      <w:pPr>
+        <w:rPr>
+          <w:rFonts w:ascii="Arial" w:hAnsi="Arial" w:cs="Arial"/>
+          <w:i/>
+          <w:iCs/>
+          <w:sz w:val="22"/>
+          <w:szCs w:val="22"/>
+          <w:lang w:val="en-US"/>
+        </w:rPr>
+      </w:pPr>
+      <w:r>
+        <w:rPr>
+          <w:rFonts w:ascii="Arial" w:hAnsi="Arial" w:cs="Arial"/>
+          <w:b/>
+          <w:bCs/>
+          <w:sz w:val="22"/>
+          <w:szCs w:val="22"/>
+          <w:lang w:val="en-US"/>
+        </w:rPr>
+        <w:t>LLM Responses:</w:t>
+      </w:r>
+      <w:r>
+        <w:rPr>
+          <w:rFonts w:ascii="Arial" w:hAnsi="Arial" w:cs="Arial"/>
+          <w:i/>
+          <w:iCs/>
+          <w:sz w:val="22"/>
+          <w:szCs w:val="22"/>
+          <w:lang w:val="en-US"/>
+        </w:rPr>
+        <w:t xml:space="preserve"> “</w:t>
+      </w:r>
+      <w:r>
+        <w:rPr>
+          <w:rFonts w:ascii="Arial" w:hAnsi="Arial" w:cs="Arial"/>
+          <w:i/>
+          <w:iCs/>
+          <w:sz w:val="22"/>
+          <w:szCs w:val="22"/>
+          <w:lang w:val="en-US"/>
+        </w:rPr>
+        <w:t xml:space="preserve">C) </w:t>
+      </w:r>
+      <w:proofErr w:type="spellStart"/>
+      <w:r>
+        <w:rPr>
+          <w:rFonts w:ascii="Arial" w:hAnsi="Arial" w:cs="Arial"/>
+          <w:i/>
+          <w:iCs/>
+          <w:sz w:val="22"/>
+          <w:szCs w:val="22"/>
+          <w:lang w:val="en-US"/>
+        </w:rPr>
+        <w:t>LangChain</w:t>
+      </w:r>
+      <w:proofErr w:type="spellEnd"/>
+      <w:r>
+        <w:rPr>
+          <w:rFonts w:ascii="Arial" w:hAnsi="Arial" w:cs="Arial"/>
+          <w:i/>
+          <w:iCs/>
+          <w:sz w:val="22"/>
+          <w:szCs w:val="22"/>
+          <w:lang w:val="en-US"/>
+        </w:rPr>
+        <w:t>:</w:t>
+      </w:r>
+    </w:p>
+    <w:p>
+      <w:pPr>
+        <w:rPr>
+          <w:rFonts w:ascii="Arial" w:hAnsi="Arial" w:cs="Arial"/>
+          <w:i/>
+          <w:iCs/>
+          <w:sz w:val="22"/>
+          <w:szCs w:val="22"/>
+          <w:lang w:val="en-US"/>
+        </w:rPr>
+      </w:pPr>
+      <w:r>
+        <w:rPr>
+          <w:rFonts w:ascii="Arial" w:hAnsi="Arial" w:cs="Arial"/>
+          <w:i/>
+          <w:iCs/>
+          <w:sz w:val="22"/>
+          <w:szCs w:val="22"/>
+          <w:lang w:val="en-US"/>
+        </w:rPr>
+        <w:t xml:space="preserve"> [{'type': 'text', 'text': '**Albert Einstein** is best known for developing the **Theory of General Relativity**, which revolutionized our understanding of gravity, space, and time.', 'extras': {'signature': 'ErMMCrAMARFNMg8rrfCa0y7x3oU+MFWY4YeHRU8YVjvvdBbXZr/KmH2KHPSaDWEpooo6fVSOE4N80QiuDxIrRq4ptbY</w:t>
+      </w:r>
+      <w:r>
+        <w:rPr>
+          <w:rFonts w:ascii="Arial" w:hAnsi="Arial" w:cs="Arial"/>
+          <w:i/>
+          <w:iCs/>
+          <w:sz w:val="22"/>
+          <w:szCs w:val="22"/>
+          <w:lang w:val="en-US"/>
+        </w:rPr>
+        <w:t>……}]</w:t>
+      </w:r>
+    </w:p>
+    <w:p>
+      <w:pPr>
+        <w:rPr>
+          <w:rFonts w:ascii="Arial" w:hAnsi="Arial" w:cs="Arial"/>
+          <w:sz w:val="22"/>
+          <w:szCs w:val="22"/>
+          <w:lang w:val="en-US"/>
+        </w:rPr>
+      </w:pPr>
+    </w:p>
+    <w:p>
+      <w:pPr>
+        <w:rPr>
+          <w:rFonts w:ascii="Arial" w:hAnsi="Arial" w:cs="Arial"/>
+          <w:sz w:val="22"/>
+          <w:szCs w:val="22"/>
+          <w:lang w:val="en-US"/>
+        </w:rPr>
+      </w:pPr>
+      <w:r>
+        <w:rPr>
+          <w:rFonts w:ascii="Arial" w:hAnsi="Arial" w:cs="Arial"/>
+          <w:sz w:val="22"/>
+          <w:szCs w:val="22"/>
+          <w:lang w:val="en-US"/>
+        </w:rPr>
+        <w:lastRenderedPageBreak/>
+        <w:t xml:space="preserve">A (raw SDK): returns direct plain text, </w:t>
+      </w:r>
+      <w:proofErr w:type="spellStart"/>
+      <w:r>
+        <w:rPr>
+          <w:rFonts w:ascii="Arial" w:hAnsi="Arial" w:cs="Arial"/>
+          <w:sz w:val="22"/>
+          <w:szCs w:val="22"/>
+          <w:lang w:val="en-US"/>
+        </w:rPr>
+        <w:t>response.text</w:t>
+      </w:r>
+      <w:proofErr w:type="spellEnd"/>
+      <w:r>
+        <w:rPr>
+          <w:rFonts w:ascii="Arial" w:hAnsi="Arial" w:cs="Arial"/>
+          <w:sz w:val="22"/>
+          <w:szCs w:val="22"/>
+          <w:lang w:val="en-US"/>
+        </w:rPr>
+        <w:t xml:space="preserve"> — the rawest form, without extra layers.</w:t>
+      </w:r>
+    </w:p>
+    <w:p>
+      <w:pPr>
+        <w:rPr>
+          <w:rFonts w:ascii="Arial" w:hAnsi="Arial" w:cs="Arial"/>
+          <w:sz w:val="22"/>
+          <w:szCs w:val="22"/>
+          <w:lang w:val="en-US"/>
+        </w:rPr>
+      </w:pPr>
+      <w:r>
+        <w:rPr>
+          <w:rFonts w:ascii="Arial" w:hAnsi="Arial" w:cs="Arial"/>
+          <w:sz w:val="22"/>
+          <w:szCs w:val="22"/>
+          <w:lang w:val="en-US"/>
+        </w:rPr>
+        <w:t>B (Google ADK): passes through the Agent with the instruction "Answer concisely, in 1-2 sentences</w:t>
+      </w:r>
+      <w:proofErr w:type="gramStart"/>
+      <w:r>
+        <w:rPr>
+          <w:rFonts w:ascii="Arial" w:hAnsi="Arial" w:cs="Arial"/>
+          <w:sz w:val="22"/>
+          <w:szCs w:val="22"/>
+          <w:lang w:val="en-US"/>
+        </w:rPr>
+        <w:t>." — this</w:t>
+      </w:r>
+      <w:proofErr w:type="gramEnd"/>
+      <w:r>
+        <w:rPr>
+          <w:rFonts w:ascii="Arial" w:hAnsi="Arial" w:cs="Arial"/>
+          <w:sz w:val="22"/>
+          <w:szCs w:val="22"/>
+          <w:lang w:val="en-US"/>
+        </w:rPr>
+        <w:t xml:space="preserve"> system instruction truncates and forces concise formatting, which is why it's shorter than A (which didn't have an instruction, leaving the model to add Markdown/bold/formula formatting).</w:t>
+      </w:r>
+    </w:p>
+    <w:p>
+      <w:pPr>
+        <w:rPr>
+          <w:rFonts w:ascii="Arial" w:hAnsi="Arial" w:cs="Arial"/>
+          <w:sz w:val="22"/>
+          <w:szCs w:val="22"/>
+          <w:lang w:val="en-US"/>
+        </w:rPr>
+      </w:pPr>
+      <w:r>
+        <w:rPr>
+          <w:rFonts w:ascii="Arial" w:hAnsi="Arial" w:cs="Arial"/>
+          <w:sz w:val="22"/>
+          <w:szCs w:val="22"/>
+          <w:lang w:val="en-US"/>
+        </w:rPr>
+        <w:t>C (</w:t>
+      </w:r>
+      <w:proofErr w:type="spellStart"/>
+      <w:r>
+        <w:rPr>
+          <w:rFonts w:ascii="Arial" w:hAnsi="Arial" w:cs="Arial"/>
+          <w:sz w:val="22"/>
+          <w:szCs w:val="22"/>
+          <w:lang w:val="en-US"/>
+        </w:rPr>
+        <w:t>LangChain</w:t>
+      </w:r>
+      <w:proofErr w:type="spellEnd"/>
+      <w:r>
+        <w:rPr>
+          <w:rFonts w:ascii="Arial" w:hAnsi="Arial" w:cs="Arial"/>
+          <w:sz w:val="22"/>
+          <w:szCs w:val="22"/>
+          <w:lang w:val="en-US"/>
+        </w:rPr>
+        <w:t xml:space="preserve">): same model, but </w:t>
+      </w:r>
+      <w:proofErr w:type="spellStart"/>
+      <w:r>
+        <w:rPr>
+          <w:rFonts w:ascii="Arial" w:hAnsi="Arial" w:cs="Arial"/>
+          <w:sz w:val="22"/>
+          <w:szCs w:val="22"/>
+          <w:lang w:val="en-US"/>
+        </w:rPr>
+        <w:t>ChatGoogleGenerativeAI</w:t>
+      </w:r>
+      <w:proofErr w:type="spellEnd"/>
+      <w:r>
+        <w:rPr>
+          <w:rFonts w:ascii="Arial" w:hAnsi="Arial" w:cs="Arial"/>
+          <w:sz w:val="22"/>
+          <w:szCs w:val="22"/>
+          <w:lang w:val="en-US"/>
+        </w:rPr>
+        <w:t xml:space="preserve"> wraps the response in a block list structure ([{'type': 'text', 'text': ..., 'extras': {'signature': ...}}]) instead of a plain string — the signature is internal Gemini metadata (thought signature), not part of the actual text. The background content is equivalent to A; only the library's wrapper/format changes.</w:t>
+      </w:r>
+    </w:p>
+    <w:p>
+      <w:pPr>
+        <w:rPr>
+          <w:rFonts w:ascii="Arial" w:hAnsi="Arial" w:cs="Arial"/>
+          <w:sz w:val="22"/>
+          <w:szCs w:val="22"/>
+          <w:lang w:val="en-US"/>
+        </w:rPr>
+      </w:pPr>
+    </w:p>
+    <w:p>
+      <w:pPr>
+        <w:rPr>
+          <w:rFonts w:ascii="Arial" w:hAnsi="Arial" w:cs="Arial"/>
+          <w:sz w:val="22"/>
+          <w:szCs w:val="22"/>
+          <w:lang w:val="en-US"/>
+        </w:rPr>
+      </w:pPr>
+      <w:r>
+        <w:rPr>
+          <w:rFonts w:ascii="Arial" w:hAnsi="Arial" w:cs="Arial"/>
+          <w:sz w:val="22"/>
+          <w:szCs w:val="22"/>
+          <w:lang w:val="en-US"/>
+        </w:rPr>
+        <w:t xml:space="preserve">Conclusion: Same Gemini model underneath the 3, differences come from how each layer (raw SDK vs agent with instruction vs </w:t>
+      </w:r>
+      <w:proofErr w:type="spellStart"/>
+      <w:r>
+        <w:rPr>
+          <w:rFonts w:ascii="Arial" w:hAnsi="Arial" w:cs="Arial"/>
+          <w:sz w:val="22"/>
+          <w:szCs w:val="22"/>
+          <w:lang w:val="en-US"/>
+        </w:rPr>
+        <w:t>LangChain</w:t>
+      </w:r>
+      <w:proofErr w:type="spellEnd"/>
+      <w:r>
+        <w:rPr>
+          <w:rFonts w:ascii="Arial" w:hAnsi="Arial" w:cs="Arial"/>
+          <w:sz w:val="22"/>
+          <w:szCs w:val="22"/>
+          <w:lang w:val="en-US"/>
+        </w:rPr>
+        <w:t xml:space="preserve"> wrapper) post-processes/formats the output, not from the model itself.</w:t>
+      </w:r>
+    </w:p>
+    <w:p>
+      <w:pPr>
+        <w:rPr>
+          <w:rFonts w:ascii="Arial" w:hAnsi="Arial" w:cs="Arial"/>
+          <w:sz w:val="22"/>
+          <w:szCs w:val="22"/>
+          <w:lang w:val="en-US"/>
+        </w:rPr>
+      </w:pPr>
+    </w:p>
+    <w:p>
+      <w:pPr>
+        <w:rPr>
+          <w:rFonts w:ascii="Arial" w:hAnsi="Arial" w:cs="Arial"/>
+          <w:sz w:val="22"/>
+          <w:szCs w:val="22"/>
+          <w:lang w:val="en-US"/>
+        </w:rPr>
+      </w:pPr>
+      <w:r>
+        <w:rPr>
+          <w:rFonts w:ascii="Arial" w:hAnsi="Arial" w:cs="Arial"/>
+          <w:sz w:val="22"/>
+          <w:szCs w:val="22"/>
+          <w:lang w:val="en-US"/>
+        </w:rPr>
+        <w:t xml:space="preserve">I just created a </w:t>
+      </w:r>
+      <w:proofErr w:type="spellStart"/>
+      <w:r>
+        <w:rPr>
+          <w:rFonts w:ascii="Arial" w:hAnsi="Arial" w:cs="Arial"/>
+          <w:sz w:val="22"/>
+          <w:szCs w:val="22"/>
+          <w:lang w:val="en-US"/>
+        </w:rPr>
+        <w:t>github</w:t>
+      </w:r>
+      <w:proofErr w:type="spellEnd"/>
+      <w:r>
+        <w:rPr>
+          <w:rFonts w:ascii="Arial" w:hAnsi="Arial" w:cs="Arial"/>
+          <w:sz w:val="22"/>
+          <w:szCs w:val="22"/>
+          <w:lang w:val="en-US"/>
+        </w:rPr>
+        <w:t xml:space="preserve"> repository to upload </w:t>
+      </w:r>
+      <w:proofErr w:type="gramStart"/>
+      <w:r>
+        <w:rPr>
+          <w:rFonts w:ascii="Arial" w:hAnsi="Arial" w:cs="Arial"/>
+          <w:sz w:val="22"/>
+          <w:szCs w:val="22"/>
+          <w:lang w:val="en-US"/>
+        </w:rPr>
+        <w:t>all of</w:t>
+      </w:r>
+      <w:proofErr w:type="gramEnd"/>
+      <w:r>
+        <w:rPr>
+          <w:rFonts w:ascii="Arial" w:hAnsi="Arial" w:cs="Arial"/>
+          <w:sz w:val="22"/>
+          <w:szCs w:val="22"/>
+          <w:lang w:val="en-US"/>
+        </w:rPr>
+        <w:t xml:space="preserve"> the different sessions that I’m going to be working on. This is the URL: </w:t>
+      </w:r>
+      <w:hyperlink r:id="rId19" w:history="1">
+        <w:r>
+          <w:rPr>
+            <w:rStyle w:val="Hipervnculo"/>
+            <w:rFonts w:ascii="Arial" w:hAnsi="Arial" w:cs="Arial"/>
+            <w:sz w:val="22"/>
+            <w:szCs w:val="22"/>
+            <w:lang w:val="en-US"/>
+          </w:rPr>
+          <w:t>https://github.com/JoseMartInez2611/ai_agentic_class</w:t>
+        </w:r>
+      </w:hyperlink>
+      <w:r>
+        <w:rPr>
+          <w:rFonts w:ascii="Arial" w:hAnsi="Arial" w:cs="Arial"/>
+          <w:sz w:val="22"/>
+          <w:szCs w:val="22"/>
+          <w:lang w:val="en-US"/>
+        </w:rPr>
+        <w:t xml:space="preserve"> </w:t>
+      </w:r>
+    </w:p>
+    <w:p>
+      <w:pPr>
+        <w:rPr>
+          <w:rFonts w:ascii="Arial" w:hAnsi="Arial" w:cs="Arial"/>
+          <w:lang w:val="en-US"/>
         </w:rPr>
       </w:pPr>
     </w:p>
@@ -961,50 +2951,140 @@
         <w:pStyle w:val="Ttulo2"/>
         <w:rPr>
           <w:rFonts w:ascii="Arial" w:hAnsi="Arial" w:cs="Arial"/>
+          <w:b/>
+          <w:bCs/>
           <w:color w:val="auto"/>
           <w:sz w:val="24"/>
           <w:szCs w:val="24"/>
-          <w:lang w:val="es-419"/>
-        </w:rPr>
-      </w:pPr>
-      <w:proofErr w:type="spellStart"/>
-      <w:r>
-        <w:rPr>
-          <w:rFonts w:ascii="Arial" w:hAnsi="Arial" w:cs="Arial"/>
+          <w:lang w:val="en-US"/>
+        </w:rPr>
+      </w:pPr>
+      <w:r>
+        <w:rPr>
+          <w:rFonts w:ascii="Arial" w:hAnsi="Arial" w:cs="Arial"/>
+          <w:b/>
+          <w:bCs/>
           <w:color w:val="auto"/>
           <w:sz w:val="24"/>
           <w:szCs w:val="24"/>
-          <w:lang w:val="es-419"/>
-        </w:rPr>
-        <w:t>Activity</w:t>
-      </w:r>
-      <w:proofErr w:type="spellEnd"/>
-      <w:r>
-        <w:rPr>
-          <w:rFonts w:ascii="Arial" w:hAnsi="Arial" w:cs="Arial"/>
-          <w:color w:val="auto"/>
-          <w:sz w:val="24"/>
-          <w:szCs w:val="24"/>
-          <w:lang w:val="es-419"/>
+          <w:lang w:val="en-US"/>
+        </w:rPr>
+        <w:t>Activity 6</w:t>
+      </w:r>
+    </w:p>
+    <w:p>
+      <w:pPr>
+        <w:rPr>
+          <w:rFonts w:ascii="Arial" w:hAnsi="Arial" w:cs="Arial"/>
+          <w:lang w:val="en-US"/>
+        </w:rPr>
+      </w:pPr>
+      <w:r>
+        <w:rPr>
+          <w:rFonts w:ascii="Arial" w:hAnsi="Arial" w:cs="Arial"/>
+          <w:lang w:val="en-US"/>
+        </w:rPr>
+        <w:t>Corte 1 Project Checkpoint &amp; Independent Work</w:t>
+      </w:r>
+    </w:p>
+    <w:p>
+      <w:pPr>
+        <w:rPr>
+          <w:rFonts w:ascii="Arial" w:hAnsi="Arial" w:cs="Arial"/>
+          <w:lang w:val="en-US"/>
+        </w:rPr>
+      </w:pPr>
+      <w:r>
+        <w:rPr>
+          <w:rFonts w:ascii="Arial" w:hAnsi="Arial" w:cs="Arial"/>
+          <w:lang w:val="en-US"/>
+        </w:rPr>
+        <w:t>•</w:t>
+      </w:r>
+      <w:r>
+        <w:rPr>
+          <w:rFonts w:ascii="Arial" w:hAnsi="Arial" w:cs="Arial"/>
+          <w:lang w:val="en-US"/>
+        </w:rPr>
+        <w:tab/>
+        <w:t>Choose the document domain your assistant will answer questions about (e.g. your program's course catalog, a hobby's rulebook, your own class notes, a product's documentation). Pick something you have 5–20 real documents or pages for — you'll need it for chunking in Week 4.</w:t>
+      </w:r>
+    </w:p>
+    <w:p>
+      <w:pPr>
+        <w:rPr>
+          <w:rFonts w:ascii="Arial" w:hAnsi="Arial" w:cs="Arial"/>
+          <w:lang w:val="en-US"/>
+        </w:rPr>
+      </w:pPr>
+      <w:r>
+        <w:rPr>
+          <w:rFonts w:ascii="Arial" w:hAnsi="Arial" w:cs="Arial"/>
+          <w:lang w:val="en-US"/>
+        </w:rPr>
+        <w:t>R/ A calculus tutoring assistant that answers questions about a first-semester calculus course (limits, derivatives, and integrals). It solves exercises step by step, explaining the reasoning and the theorem/rule behind each step, and answers theoretical questions grounded in calculus lecture notes and textbook chapters via RAG, rather than relying only on the model's general knowledge.</w:t>
+      </w:r>
+    </w:p>
+    <w:p>
+      <w:pPr>
+        <w:rPr>
+          <w:rFonts w:ascii="Arial" w:hAnsi="Arial" w:cs="Arial"/>
+          <w:lang w:val="en-US"/>
+        </w:rPr>
+      </w:pPr>
+      <w:r>
+        <w:rPr>
+          <w:rFonts w:ascii="Arial" w:hAnsi="Arial" w:cs="Arial"/>
+          <w:lang w:val="en-US"/>
+        </w:rPr>
+        <w:t>•</w:t>
+      </w:r>
+      <w:r>
+        <w:rPr>
+          <w:rFonts w:ascii="Arial" w:hAnsi="Arial" w:cs="Arial"/>
+          <w:lang w:val="en-US"/>
+        </w:rPr>
+        <w:tab/>
+        <w:t>Write a 3–5 sentence project proposal (what it answers questions about, who it's for) and push it as PROPOSAL.md to your course GitHub repository.</w:t>
+      </w:r>
+    </w:p>
+    <w:p>
+      <w:pPr>
+        <w:rPr>
+          <w:rFonts w:ascii="Arial" w:hAnsi="Arial" w:cs="Arial"/>
+          <w:lang w:val="en-US"/>
+        </w:rPr>
+      </w:pPr>
+      <w:r>
+        <w:rPr>
+          <w:rFonts w:ascii="Arial" w:hAnsi="Arial" w:cs="Arial"/>
+          <w:lang w:val="en-US"/>
+        </w:rPr>
+        <w:t xml:space="preserve">R/ </w:t>
+      </w:r>
+      <w:hyperlink r:id="rId20" w:history="1">
+        <w:r>
+          <w:rPr>
+            <w:rStyle w:val="Hipervnculo"/>
+            <w:rFonts w:ascii="Arial" w:hAnsi="Arial" w:cs="Arial"/>
+            <w:lang w:val="en-US"/>
+          </w:rPr>
+          <w:t>https://github.com/JulianGuardian/Cubik-Lite</w:t>
+        </w:r>
+      </w:hyperlink>
+      <w:r>
+        <w:rPr>
+          <w:rFonts w:ascii="Arial" w:hAnsi="Arial" w:cs="Arial"/>
+          <w:lang w:val="en-US"/>
         </w:rPr>
         <w:t xml:space="preserve"> </w:t>
       </w:r>
-      <w:r>
-        <w:rPr>
-          <w:rFonts w:ascii="Arial" w:hAnsi="Arial" w:cs="Arial"/>
-          <w:color w:val="auto"/>
-          <w:sz w:val="24"/>
-          <w:szCs w:val="24"/>
-          <w:lang w:val="es-419"/>
-        </w:rPr>
-        <w:t>4</w:t>
-      </w:r>
-    </w:p>
-    <w:p>
-      <w:pPr>
-        <w:rPr>
-          <w:rFonts w:ascii="Arial" w:hAnsi="Arial" w:cs="Arial"/>
-          <w:lang w:val="es-419"/>
+    </w:p>
+    <w:p>
+      <w:pPr>
+        <w:rPr>
+          <w:rFonts w:ascii="Arial" w:hAnsi="Arial" w:cs="Arial"/>
+          <w:lang w:val="en-US"/>
         </w:rPr>
       </w:pPr>
     </w:p>
@@ -1013,116 +3093,15 @@
         <w:pStyle w:val="Ttulo2"/>
         <w:rPr>
           <w:rFonts w:ascii="Arial" w:hAnsi="Arial" w:cs="Arial"/>
-          <w:color w:val="auto"/>
-          <w:sz w:val="24"/>
-          <w:szCs w:val="24"/>
-          <w:lang w:val="es-419"/>
-        </w:rPr>
-      </w:pPr>
-      <w:proofErr w:type="spellStart"/>
-      <w:r>
-        <w:rPr>
-          <w:rFonts w:ascii="Arial" w:hAnsi="Arial" w:cs="Arial"/>
-          <w:color w:val="auto"/>
-          <w:sz w:val="24"/>
-          <w:szCs w:val="24"/>
-          <w:lang w:val="es-419"/>
-        </w:rPr>
-        <w:t>Activity</w:t>
-      </w:r>
-      <w:proofErr w:type="spellEnd"/>
-      <w:r>
-        <w:rPr>
-          <w:rFonts w:ascii="Arial" w:hAnsi="Arial" w:cs="Arial"/>
-          <w:color w:val="auto"/>
-          <w:sz w:val="24"/>
-          <w:szCs w:val="24"/>
-          <w:lang w:val="es-419"/>
-        </w:rPr>
-        <w:t xml:space="preserve"> </w:t>
-      </w:r>
-      <w:r>
-        <w:rPr>
-          <w:rFonts w:ascii="Arial" w:hAnsi="Arial" w:cs="Arial"/>
-          <w:color w:val="auto"/>
-          <w:sz w:val="24"/>
-          <w:szCs w:val="24"/>
-          <w:lang w:val="es-419"/>
-        </w:rPr>
-        <w:t>5</w:t>
-      </w:r>
-    </w:p>
-    <w:p>
-      <w:pPr>
-        <w:rPr>
-          <w:rFonts w:ascii="Arial" w:hAnsi="Arial" w:cs="Arial"/>
-          <w:lang w:val="es-419"/>
-        </w:rPr>
-      </w:pPr>
-    </w:p>
-    <w:p>
-      <w:pPr>
-        <w:pStyle w:val="Ttulo2"/>
-        <w:rPr>
-          <w:rFonts w:ascii="Arial" w:hAnsi="Arial" w:cs="Arial"/>
-          <w:color w:val="auto"/>
-          <w:sz w:val="24"/>
-          <w:szCs w:val="24"/>
-          <w:lang w:val="es-419"/>
-        </w:rPr>
-      </w:pPr>
-      <w:proofErr w:type="spellStart"/>
-      <w:r>
-        <w:rPr>
-          <w:rFonts w:ascii="Arial" w:hAnsi="Arial" w:cs="Arial"/>
-          <w:color w:val="auto"/>
-          <w:sz w:val="24"/>
-          <w:szCs w:val="24"/>
-          <w:lang w:val="es-419"/>
-        </w:rPr>
-        <w:t>Activity</w:t>
-      </w:r>
-      <w:proofErr w:type="spellEnd"/>
-      <w:r>
-        <w:rPr>
-          <w:rFonts w:ascii="Arial" w:hAnsi="Arial" w:cs="Arial"/>
-          <w:color w:val="auto"/>
-          <w:sz w:val="24"/>
-          <w:szCs w:val="24"/>
-          <w:lang w:val="es-419"/>
-        </w:rPr>
-        <w:t xml:space="preserve"> </w:t>
-      </w:r>
-      <w:r>
-        <w:rPr>
-          <w:rFonts w:ascii="Arial" w:hAnsi="Arial" w:cs="Arial"/>
-          <w:color w:val="auto"/>
-          <w:sz w:val="24"/>
-          <w:szCs w:val="24"/>
-          <w:lang w:val="es-419"/>
-        </w:rPr>
-        <w:t>6</w:t>
-      </w:r>
-    </w:p>
-    <w:p>
-      <w:pPr>
-        <w:rPr>
-          <w:lang w:val="es-419"/>
-        </w:rPr>
-      </w:pPr>
-    </w:p>
-    <w:p>
-      <w:pPr>
-        <w:pStyle w:val="Ttulo2"/>
-        <w:rPr>
-          <w:lang w:val="es-419"/>
-        </w:rPr>
-      </w:pPr>
-    </w:p>
-    <w:p>
-      <w:pPr>
-        <w:rPr>
-          <w:lang w:val="es-419"/>
+          <w:lang w:val="en-US"/>
+        </w:rPr>
+      </w:pPr>
+    </w:p>
+    <w:p>
+      <w:pPr>
+        <w:rPr>
+          <w:rFonts w:ascii="Arial" w:hAnsi="Arial" w:cs="Arial"/>
+          <w:lang w:val="en-US"/>
         </w:rPr>
       </w:pPr>
     </w:p>
@@ -1134,6 +3113,56 @@
     </w:sectPr>
   </w:body>
 </w:document>
+</file>
+
+<file path=word/endnotes.xml><?xml version="1.0" encoding="utf-8"?>
+<w:endnotes xmlns:wpc="http://schemas.microsoft.com/office/word/2010/wordprocessingCanvas" xmlns:cx="http://schemas.microsoft.com/office/drawing/2014/chartex" xmlns:cx1="http://schemas.microsoft.com/office/drawing/2015/9/8/chartex" xmlns:cx2="http://schemas.microsoft.com/office/drawing/2015/10/21/chartex" xmlns:cx3="http://schemas.microsoft.com/office/drawing/2016/5/9/chartex" xmlns:cx4="http://schemas.microsoft.com/office/drawing/2016/5/10/chartex" xmlns:cx5="http://schemas.microsoft.com/office/drawing/2016/5/11/chartex" xmlns:cx6="http://schemas.microsoft.com/office/drawing/2016/5/12/chartex" xmlns:cx7="http://schemas.microsoft.com/office/drawing/2016/5/13/chartex" xmlns:cx8="http://schemas.microsoft.com/office/drawing/2016/5/14/chartex" xmlns:mc="http://schemas.openxmlformats.org/markup-compatibility/2006" xmlns:aink="http://schemas.microsoft.com/office/drawing/2016/ink" xmlns:am3d="http://schemas.microsoft.com/office/drawing/2017/model3d" xmlns:o="urn:schemas-microsoft-com:office:office" xmlns:oel="http://schemas.microsoft.com/office/2019/extlst" xmlns:r="http://schemas.openxmlformats.org/officeDocument/2006/relationships" xmlns:m="http://schemas.openxmlformats.org/officeDocument/2006/math" xmlns:v="urn:schemas-microsoft-com:vml" xmlns:wp14="http://schemas.microsoft.com/office/word/2010/wordprocessingDrawing" xmlns:wp="http://schemas.openxmlformats.org/drawingml/2006/wordprocessingDrawing" xmlns:w10="urn:schemas-microsoft-com:office:word" xmlns:w="http://schemas.openxmlformats.org/wordprocessingml/2006/main" xmlns:w14="http://schemas.microsoft.com/office/word/2010/wordml" xmlns:w15="http://schemas.microsoft.com/office/word/2012/wordml" xmlns:w16cex="http://schemas.microsoft.com/office/word/2018/wordml/cex" xmlns:w16cid="http://schemas.microsoft.com/office/word/2016/wordml/cid" xmlns:w16="http://schemas.microsoft.com/office/word/2018/wordml" xmlns:w16du="http://schemas.microsoft.com/office/word/2023/wordml/word16du" xmlns:w16sdtdh="http://schemas.microsoft.com/office/word/2020/wordml/sdtdatahash" xmlns:w16sdtfl="http://schemas.microsoft.com/office/word/2024/wordml/sdtformatlock" xmlns:w16se="http://schemas.microsoft.com/office/word/2015/wordml/symex" xmlns:wpg="http://schemas.microsoft.com/office/word/2010/wordprocessingGroup" xmlns:wpi="http://schemas.microsoft.com/office/word/2010/wordprocessingInk" xmlns:wne="http://schemas.microsoft.com/office/word/2006/wordml" xmlns:wps="http://schemas.microsoft.com/office/word/2010/wordprocessingShape" mc:Ignorable="w14 w15 w16se w16cid w16 w16cex w16sdtdh w16sdtfl w16du wp14">
+  <w:endnote w:type="separator" w:id="-1">
+    <w:p>
+      <w:pPr>
+        <w:spacing w:after="0" w:line="240" w:lineRule="auto"/>
+      </w:pPr>
+      <w:r>
+        <w:separator/>
+      </w:r>
+    </w:p>
+  </w:endnote>
+  <w:endnote w:type="continuationSeparator" w:id="0">
+    <w:p>
+      <w:pPr>
+        <w:spacing w:after="0" w:line="240" w:lineRule="auto"/>
+      </w:pPr>
+      <w:r>
+        <w:continuationSeparator/>
+      </w:r>
+    </w:p>
+  </w:endnote>
+</w:endnotes>
+</file>
+
+<file path=word/footnotes.xml><?xml version="1.0" encoding="utf-8"?>
+<w:footnotes xmlns:wpc="http://schemas.microsoft.com/office/word/2010/wordprocessingCanvas" xmlns:cx="http://schemas.microsoft.com/office/drawing/2014/chartex" xmlns:cx1="http://schemas.microsoft.com/office/drawing/2015/9/8/chartex" xmlns:cx2="http://schemas.microsoft.com/office/drawing/2015/10/21/chartex" xmlns:cx3="http://schemas.microsoft.com/office/drawing/2016/5/9/chartex" xmlns:cx4="http://schemas.microsoft.com/office/drawing/2016/5/10/chartex" xmlns:cx5="http://schemas.microsoft.com/office/drawing/2016/5/11/chartex" xmlns:cx6="http://schemas.microsoft.com/office/drawing/2016/5/12/chartex" xmlns:cx7="http://schemas.microsoft.com/office/drawing/2016/5/13/chartex" xmlns:cx8="http://schemas.microsoft.com/office/drawing/2016/5/14/chartex" xmlns:mc="http://schemas.openxmlformats.org/markup-compatibility/2006" xmlns:aink="http://schemas.microsoft.com/office/drawing/2016/ink" xmlns:am3d="http://schemas.microsoft.com/office/drawing/2017/model3d" xmlns:o="urn:schemas-microsoft-com:office:office" xmlns:oel="http://schemas.microsoft.com/office/2019/extlst" xmlns:r="http://schemas.openxmlformats.org/officeDocument/2006/relationships" xmlns:m="http://schemas.openxmlformats.org/officeDocument/2006/math" xmlns:v="urn:schemas-microsoft-com:vml" xmlns:wp14="http://schemas.microsoft.com/office/word/2010/wordprocessingDrawing" xmlns:wp="http://schemas.openxmlformats.org/drawingml/2006/wordprocessingDrawing" xmlns:w10="urn:schemas-microsoft-com:office:word" xmlns:w="http://schemas.openxmlformats.org/wordprocessingml/2006/main" xmlns:w14="http://schemas.microsoft.com/office/word/2010/wordml" xmlns:w15="http://schemas.microsoft.com/office/word/2012/wordml" xmlns:w16cex="http://schemas.microsoft.com/office/word/2018/wordml/cex" xmlns:w16cid="http://schemas.microsoft.com/office/word/2016/wordml/cid" xmlns:w16="http://schemas.microsoft.com/office/word/2018/wordml" xmlns:w16du="http://schemas.microsoft.com/office/word/2023/wordml/word16du" xmlns:w16sdtdh="http://schemas.microsoft.com/office/word/2020/wordml/sdtdatahash" xmlns:w16sdtfl="http://schemas.microsoft.com/office/word/2024/wordml/sdtformatlock" xmlns:w16se="http://schemas.microsoft.com/office/word/2015/wordml/symex" xmlns:wpg="http://schemas.microsoft.com/office/word/2010/wordprocessingGroup" xmlns:wpi="http://schemas.microsoft.com/office/word/2010/wordprocessingInk" xmlns:wne="http://schemas.microsoft.com/office/word/2006/wordml" xmlns:wps="http://schemas.microsoft.com/office/word/2010/wordprocessingShape" mc:Ignorable="w14 w15 w16se w16cid w16 w16cex w16sdtdh w16sdtfl w16du wp14">
+  <w:footnote w:type="separator" w:id="-1">
+    <w:p>
+      <w:pPr>
+        <w:spacing w:after="0" w:line="240" w:lineRule="auto"/>
+      </w:pPr>
+      <w:r>
+        <w:separator/>
+      </w:r>
+    </w:p>
+  </w:footnote>
+  <w:footnote w:type="continuationSeparator" w:id="0">
+    <w:p>
+      <w:pPr>
+        <w:spacing w:after="0" w:line="240" w:lineRule="auto"/>
+      </w:pPr>
+      <w:r>
+        <w:continuationSeparator/>
+      </w:r>
+    </w:p>
+  </w:footnote>
+</w:footnotes>
 </file>
 
 <file path=word/numbering.xml><?xml version="1.0" encoding="utf-8"?>
@@ -2291,6 +4320,73 @@
       <w:spacing w:val="5"/>
     </w:rPr>
   </w:style>
+  <w:style w:type="character" w:styleId="Hipervnculo">
+    <w:name w:val="Hyperlink"/>
+    <w:basedOn w:val="Fuentedeprrafopredeter"/>
+    <w:uiPriority w:val="99"/>
+    <w:unhideWhenUsed/>
+    <w:rsid w:val="00D97294"/>
+    <w:rPr>
+      <w:color w:val="467886" w:themeColor="hyperlink"/>
+      <w:u w:val="single"/>
+    </w:rPr>
+  </w:style>
+  <w:style w:type="character" w:styleId="Mencinsinresolver">
+    <w:name w:val="Unresolved Mention"/>
+    <w:basedOn w:val="Fuentedeprrafopredeter"/>
+    <w:uiPriority w:val="99"/>
+    <w:semiHidden/>
+    <w:unhideWhenUsed/>
+    <w:rsid w:val="00D97294"/>
+    <w:rPr>
+      <w:color w:val="605E5C"/>
+      <w:shd w:val="clear" w:color="auto" w:fill="E1DFDD"/>
+    </w:rPr>
+  </w:style>
+  <w:style w:type="paragraph" w:styleId="Encabezado">
+    <w:name w:val="header"/>
+    <w:basedOn w:val="Normal"/>
+    <w:link w:val="EncabezadoCar"/>
+    <w:uiPriority w:val="99"/>
+    <w:unhideWhenUsed/>
+    <w:rsid w:val="00DB0DB7"/>
+    <w:pPr>
+      <w:tabs>
+        <w:tab w:val="center" w:pos="4419"/>
+        <w:tab w:val="right" w:pos="8838"/>
+      </w:tabs>
+      <w:spacing w:after="0" w:line="240" w:lineRule="auto"/>
+    </w:pPr>
+  </w:style>
+  <w:style w:type="character" w:customStyle="1" w:styleId="EncabezadoCar">
+    <w:name w:val="Encabezado Car"/>
+    <w:basedOn w:val="Fuentedeprrafopredeter"/>
+    <w:link w:val="Encabezado"/>
+    <w:uiPriority w:val="99"/>
+    <w:rsid w:val="00DB0DB7"/>
+  </w:style>
+  <w:style w:type="paragraph" w:styleId="Piedepgina">
+    <w:name w:val="footer"/>
+    <w:basedOn w:val="Normal"/>
+    <w:link w:val="PiedepginaCar"/>
+    <w:uiPriority w:val="99"/>
+    <w:unhideWhenUsed/>
+    <w:rsid w:val="00DB0DB7"/>
+    <w:pPr>
+      <w:tabs>
+        <w:tab w:val="center" w:pos="4419"/>
+        <w:tab w:val="right" w:pos="8838"/>
+      </w:tabs>
+      <w:spacing w:after="0" w:line="240" w:lineRule="auto"/>
+    </w:pPr>
+  </w:style>
+  <w:style w:type="character" w:customStyle="1" w:styleId="PiedepginaCar">
+    <w:name w:val="Pie de página Car"/>
+    <w:basedOn w:val="Fuentedeprrafopredeter"/>
+    <w:link w:val="Piedepgina"/>
+    <w:uiPriority w:val="99"/>
+    <w:rsid w:val="00DB0DB7"/>
+  </w:style>
 </w:styles>
 </file>
 

</xml_diff>